<commit_message>
Se modifico el REPORTE.docx añadiendo la descripción del conjunto de datos
</commit_message>
<xml_diff>
--- a/REPORTE.docx
+++ b/REPORTE.docx
@@ -1,6 +1,6 @@
 
 <file path=word/document.xml><?xml version="1.0" encoding="utf-8"?>
-<w:document xmlns:wpc="http://schemas.microsoft.com/office/word/2010/wordprocessingCanvas" xmlns:cx="http://schemas.microsoft.com/office/drawing/2014/chartex" xmlns:cx1="http://schemas.microsoft.com/office/drawing/2015/9/8/chartex" xmlns:cx2="http://schemas.microsoft.com/office/drawing/2015/10/21/chartex" xmlns:cx3="http://schemas.microsoft.com/office/drawing/2016/5/9/chartex" xmlns:cx4="http://schemas.microsoft.com/office/drawing/2016/5/10/chartex" xmlns:cx5="http://schemas.microsoft.com/office/drawing/2016/5/11/chartex" xmlns:cx6="http://schemas.microsoft.com/office/drawing/2016/5/12/chartex" xmlns:cx7="http://schemas.microsoft.com/office/drawing/2016/5/13/chartex" xmlns:cx8="http://schemas.microsoft.com/office/drawing/2016/5/14/chartex" xmlns:mc="http://schemas.openxmlformats.org/markup-compatibility/2006" xmlns:aink="http://schemas.microsoft.com/office/drawing/2016/ink" xmlns:am3d="http://schemas.microsoft.com/office/drawing/2017/model3d" xmlns:o="urn:schemas-microsoft-com:office:office" xmlns:oel="http://schemas.microsoft.com/office/2019/extlst" xmlns:r="http://schemas.openxmlformats.org/officeDocument/2006/relationships" xmlns:m="http://schemas.openxmlformats.org/officeDocument/2006/math" xmlns:v="urn:schemas-microsoft-com:vml" xmlns:wp14="http://schemas.microsoft.com/office/word/2010/wordprocessingDrawing" xmlns:wp="http://schemas.openxmlformats.org/drawingml/2006/wordprocessingDrawing" xmlns:w10="urn:schemas-microsoft-com:office:word" xmlns:w="http://schemas.openxmlformats.org/wordprocessingml/2006/main" xmlns:w14="http://schemas.microsoft.com/office/word/2010/wordml" xmlns:w15="http://schemas.microsoft.com/office/word/2012/wordml" xmlns:w16cex="http://schemas.microsoft.com/office/word/2018/wordml/cex" xmlns:w16cid="http://schemas.microsoft.com/office/word/2016/wordml/cid" xmlns:w16="http://schemas.microsoft.com/office/word/2018/wordml" xmlns:w16sdtdh="http://schemas.microsoft.com/office/word/2020/wordml/sdtdatahash" xmlns:w16se="http://schemas.microsoft.com/office/word/2015/wordml/symex" xmlns:wpg="http://schemas.microsoft.com/office/word/2010/wordprocessingGroup" xmlns:wpi="http://schemas.microsoft.com/office/word/2010/wordprocessingInk" xmlns:wne="http://schemas.microsoft.com/office/word/2006/wordml" xmlns:wps="http://schemas.microsoft.com/office/word/2010/wordprocessingShape" mc:Ignorable="w14 w15 w16se w16cid w16 w16cex w16sdtdh wp14">
+<w:document xmlns:wpc="http://schemas.microsoft.com/office/word/2010/wordprocessingCanvas" xmlns:cx="http://schemas.microsoft.com/office/drawing/2014/chartex" xmlns:cx1="http://schemas.microsoft.com/office/drawing/2015/9/8/chartex" xmlns:cx2="http://schemas.microsoft.com/office/drawing/2015/10/21/chartex" xmlns:cx3="http://schemas.microsoft.com/office/drawing/2016/5/9/chartex" xmlns:cx4="http://schemas.microsoft.com/office/drawing/2016/5/10/chartex" xmlns:cx5="http://schemas.microsoft.com/office/drawing/2016/5/11/chartex" xmlns:cx6="http://schemas.microsoft.com/office/drawing/2016/5/12/chartex" xmlns:cx7="http://schemas.microsoft.com/office/drawing/2016/5/13/chartex" xmlns:cx8="http://schemas.microsoft.com/office/drawing/2016/5/14/chartex" xmlns:mc="http://schemas.openxmlformats.org/markup-compatibility/2006" xmlns:aink="http://schemas.microsoft.com/office/drawing/2016/ink" xmlns:am3d="http://schemas.microsoft.com/office/drawing/2017/model3d" xmlns:o="urn:schemas-microsoft-com:office:office" xmlns:oel="http://schemas.microsoft.com/office/2019/extlst" xmlns:r="http://schemas.openxmlformats.org/officeDocument/2006/relationships" xmlns:m="http://schemas.openxmlformats.org/officeDocument/2006/math" xmlns:v="urn:schemas-microsoft-com:vml" xmlns:wp14="http://schemas.microsoft.com/office/word/2010/wordprocessingDrawing" xmlns:wp="http://schemas.openxmlformats.org/drawingml/2006/wordprocessingDrawing" xmlns:w10="urn:schemas-microsoft-com:office:word" xmlns:w="http://schemas.openxmlformats.org/wordprocessingml/2006/main" xmlns:w14="http://schemas.microsoft.com/office/word/2010/wordml" xmlns:w15="http://schemas.microsoft.com/office/word/2012/wordml" xmlns:w16cei="http://schemas.microsoft.com/office/word/2026/wordml/cei" xmlns:w16cex="http://schemas.microsoft.com/office/word/2018/wordml/cex" xmlns:w16cid="http://schemas.microsoft.com/office/word/2016/wordml/cid" xmlns:w16="http://schemas.microsoft.com/office/word/2018/wordml" xmlns:w16du="http://schemas.microsoft.com/office/word/2023/wordml/word16du" xmlns:w16sdtdh="http://schemas.microsoft.com/office/word/2020/wordml/sdtdatahash" xmlns:w16sdtfl="http://schemas.microsoft.com/office/word/2024/wordml/sdtformatlock" xmlns:w16se="http://schemas.microsoft.com/office/word/2015/wordml/symex" xmlns:wpg="http://schemas.microsoft.com/office/word/2010/wordprocessingGroup" xmlns:wpi="http://schemas.microsoft.com/office/word/2010/wordprocessingInk" xmlns:wne="http://schemas.microsoft.com/office/word/2006/wordml" xmlns:wps="http://schemas.microsoft.com/office/word/2010/wordprocessingShape" mc:Ignorable="w14 w15 w16se w16cid w16 w16cex w16sdtdh w16sdtfl w16du wp14">
   <w:body>
     <w:sdt>
       <w:sdtPr>
@@ -217,6 +217,7 @@
             <w:rPr>
               <w:rFonts w:ascii="Montserrat Light" w:hAnsi="Montserrat Light"/>
               <w:b/>
+              <w:noProof/>
               <w:color w:val="5B57D1"/>
               <w:sz w:val="56"/>
               <w:lang w:val="es-CO"/>
@@ -274,6 +275,9 @@
             </w:drawing>
           </w:r>
           <w:r>
+            <w:rPr>
+              <w:noProof/>
+            </w:rPr>
             <w:drawing>
               <wp:anchor distT="0" distB="0" distL="114300" distR="114300" simplePos="0" relativeHeight="251668480" behindDoc="1" locked="0" layoutInCell="1" allowOverlap="1" wp14:anchorId="2A502B4D" wp14:editId="216D1215">
                 <wp:simplePos x="0" y="0"/>
@@ -357,6 +361,7 @@
         <w:rPr>
           <w:rFonts w:ascii="Montserrat Light" w:hAnsi="Montserrat Light"/>
           <w:b/>
+          <w:noProof/>
           <w:color w:val="5B57D1"/>
           <w:sz w:val="56"/>
           <w:lang w:val="es-CO"/>
@@ -572,23 +577,7 @@
           <w:rFonts w:ascii="Montserrat Light" w:hAnsi="Montserrat Light"/>
           <w:lang w:val="es-CO"/>
         </w:rPr>
-        <w:t xml:space="preserve"> (EOG) y la electromiografía (EMG) durante una noche completa. A partir de esas señales, un técnico certificado clasifica manualmente cada segmento de 30 segundos (época) en uno de los estadios definidos por la Academia Americana de Medicina del Sueño (AASM): vigilia (W), N1, N2, N3 y REM — un proceso que puede implicar revisar entre 800 y 1200 épocas por </w:t>
-      </w:r>
-      <w:proofErr w:type="gramStart"/>
-      <w:r>
-        <w:rPr>
-          <w:rFonts w:ascii="Montserrat Light" w:hAnsi="Montserrat Light"/>
-          <w:lang w:val="es-CO"/>
-        </w:rPr>
-        <w:t>paciente,</w:t>
-      </w:r>
-      <w:proofErr w:type="gramEnd"/>
-      <w:r>
-        <w:rPr>
-          <w:rFonts w:ascii="Montserrat Light" w:hAnsi="Montserrat Light"/>
-          <w:lang w:val="es-CO"/>
-        </w:rPr>
-        <w:t xml:space="preserve"> es lento, costoso y presenta variabilidad entre evaluadores, especialmente en estadios de transición como N1.</w:t>
+        <w:t xml:space="preserve"> (EOG) y la electromiografía (EMG) durante una noche completa. A partir de esas señales, un técnico certificado clasifica manualmente cada segmento de 30 segundos (época) en uno de los estadios definidos por la Academia Americana de Medicina del Sueño (AASM): vigilia (W), N1, N2, N3 y REM — un proceso que puede implicar revisar entre 800 y 1200 épocas por paciente, es lento, costoso y presenta variabilidad entre evaluadores, especialmente en estadios de transición como N1.</w:t>
       </w:r>
     </w:p>
     <w:p>
@@ -637,23 +626,7 @@
           <w:rFonts w:ascii="Montserrat Light" w:hAnsi="Montserrat Light"/>
           <w:lang w:val="es-CO"/>
         </w:rPr>
-        <w:t xml:space="preserve">), usando un enfoque clásico de aprendizaje de máquina (extracción de características espectrales/estadísticas + </w:t>
-      </w:r>
-      <w:proofErr w:type="spellStart"/>
-      <w:r>
-        <w:rPr>
-          <w:rFonts w:ascii="Montserrat Light" w:hAnsi="Montserrat Light"/>
-          <w:lang w:val="es-CO"/>
-        </w:rPr>
-        <w:t>Random</w:t>
-      </w:r>
-      <w:proofErr w:type="spellEnd"/>
-      <w:r>
-        <w:rPr>
-          <w:rFonts w:ascii="Montserrat Light" w:hAnsi="Montserrat Light"/>
-          <w:lang w:val="es-CO"/>
-        </w:rPr>
-        <w:t xml:space="preserve"> Forest), en lugar de arquitecturas de aprendizaje profundo como las reportadas en la literatura (</w:t>
+        <w:t>), usando un enfoque clásico de aprendizaje de máquina (extracción de características espectrales/estadísticas + Random Forest), en lugar de arquitecturas de aprendizaje profundo como las reportadas en la literatura (</w:t>
       </w:r>
       <w:proofErr w:type="spellStart"/>
       <w:r>
@@ -685,23 +658,7 @@
           <w:rFonts w:ascii="Montserrat Light" w:hAnsi="Montserrat Light"/>
           <w:lang w:val="es-CO"/>
         </w:rPr>
-        <w:t>, U-</w:t>
-      </w:r>
-      <w:proofErr w:type="spellStart"/>
-      <w:r>
-        <w:rPr>
-          <w:rFonts w:ascii="Montserrat Light" w:hAnsi="Montserrat Light"/>
-          <w:lang w:val="es-CO"/>
-        </w:rPr>
-        <w:t>Sleep</w:t>
-      </w:r>
-      <w:proofErr w:type="spellEnd"/>
-      <w:r>
-        <w:rPr>
-          <w:rFonts w:ascii="Montserrat Light" w:hAnsi="Montserrat Light"/>
-          <w:lang w:val="es-CO"/>
-        </w:rPr>
-        <w:t xml:space="preserve">). El objetivo no es competir con esas arquitecturas, sino construir la línea base metodológica —datos versionados, pipeline de extracción de características, modelo empaquetado, API y tablero de experimentación— sobre la cual se apoyará un desarrollo posterior más avanzado (multicanal, </w:t>
+        <w:t xml:space="preserve">, U-Sleep). El objetivo no es competir con esas arquitecturas, sino construir la línea base metodológica —datos versionados, pipeline de extracción de características, modelo empaquetado, API y tablero de experimentación— sobre la cual se apoyará un desarrollo posterior más avanzado (multicanal, </w:t>
       </w:r>
       <w:proofErr w:type="spellStart"/>
       <w:r>
@@ -892,23 +849,7 @@
           <w:rFonts w:ascii="Montserrat Light" w:hAnsi="Montserrat Light"/>
           <w:lang w:val="es-CO"/>
         </w:rPr>
-        <w:t xml:space="preserve">API que sirve el modelo </w:t>
-      </w:r>
-      <w:proofErr w:type="spellStart"/>
-      <w:r>
-        <w:rPr>
-          <w:rFonts w:ascii="Montserrat Light" w:hAnsi="Montserrat Light"/>
-          <w:lang w:val="es-CO"/>
-        </w:rPr>
-        <w:t>Random</w:t>
-      </w:r>
-      <w:proofErr w:type="spellEnd"/>
-      <w:r>
-        <w:rPr>
-          <w:rFonts w:ascii="Montserrat Light" w:hAnsi="Montserrat Light"/>
-          <w:lang w:val="es-CO"/>
-        </w:rPr>
-        <w:t xml:space="preserve"> Forest entrenado (recibe una época o un registro EDF completo, devuelve el estadio predicho).</w:t>
+        <w:t>API que sirve el modelo Random Forest entrenado (recibe una época o un registro EDF completo, devuelve el estadio predicho).</w:t>
       </w:r>
     </w:p>
     <w:p>
@@ -1048,57 +989,826 @@
     </w:p>
     <w:p>
       <w:pPr>
-        <w:spacing w:after="120"/>
-        <w:rPr>
-          <w:rFonts w:ascii="Montserrat Light" w:hAnsi="Montserrat Light"/>
+        <w:ind w:left="3540" w:firstLine="708"/>
+        <w:jc w:val="right"/>
+        <w:rPr>
+          <w:rFonts w:ascii="Times New Roman" w:hAnsi="Times New Roman" w:cs="Times New Roman"/>
+          <w:i/>
+          <w:iCs/>
+          <w:sz w:val="20"/>
+          <w:szCs w:val="20"/>
           <w:lang w:val="es-CO"/>
         </w:rPr>
       </w:pPr>
       <w:r>
         <w:rPr>
-          <w:rFonts w:ascii="Montserrat Light" w:hAnsi="Montserrat Light"/>
-          <w:b/>
-          <w:color w:val="444655"/>
-          <w:lang w:val="es-CO"/>
-        </w:rPr>
-        <w:t xml:space="preserve">Fuente / cita: </w:t>
+          <w:rFonts w:ascii="Times New Roman" w:hAnsi="Times New Roman" w:cs="Times New Roman"/>
+          <w:i/>
+          <w:iCs/>
+          <w:sz w:val="20"/>
+          <w:szCs w:val="20"/>
+        </w:rPr>
+        <w:t xml:space="preserve">B Kemp, AH </w:t>
+      </w:r>
+      <w:proofErr w:type="spellStart"/>
+      <w:r>
+        <w:rPr>
+          <w:rFonts w:ascii="Times New Roman" w:hAnsi="Times New Roman" w:cs="Times New Roman"/>
+          <w:i/>
+          <w:iCs/>
+          <w:sz w:val="20"/>
+          <w:szCs w:val="20"/>
+        </w:rPr>
+        <w:t>Zwinderman</w:t>
+      </w:r>
+      <w:proofErr w:type="spellEnd"/>
+      <w:r>
+        <w:rPr>
+          <w:rFonts w:ascii="Times New Roman" w:hAnsi="Times New Roman" w:cs="Times New Roman"/>
+          <w:i/>
+          <w:iCs/>
+          <w:sz w:val="20"/>
+          <w:szCs w:val="20"/>
+        </w:rPr>
+        <w:t xml:space="preserve">, B Tuk, HAC </w:t>
+      </w:r>
+      <w:proofErr w:type="spellStart"/>
+      <w:r>
+        <w:rPr>
+          <w:rFonts w:ascii="Times New Roman" w:hAnsi="Times New Roman" w:cs="Times New Roman"/>
+          <w:i/>
+          <w:iCs/>
+          <w:sz w:val="20"/>
+          <w:szCs w:val="20"/>
+        </w:rPr>
+        <w:t>Kamphuisen</w:t>
+      </w:r>
+      <w:proofErr w:type="spellEnd"/>
+      <w:r>
+        <w:rPr>
+          <w:rFonts w:ascii="Times New Roman" w:hAnsi="Times New Roman" w:cs="Times New Roman"/>
+          <w:i/>
+          <w:iCs/>
+          <w:sz w:val="20"/>
+          <w:szCs w:val="20"/>
+        </w:rPr>
+        <w:t xml:space="preserve">, JJL </w:t>
+      </w:r>
+      <w:proofErr w:type="spellStart"/>
+      <w:r>
+        <w:rPr>
+          <w:rFonts w:ascii="Times New Roman" w:hAnsi="Times New Roman" w:cs="Times New Roman"/>
+          <w:i/>
+          <w:iCs/>
+          <w:sz w:val="20"/>
+          <w:szCs w:val="20"/>
+        </w:rPr>
+        <w:t>Oberyé</w:t>
+      </w:r>
+      <w:proofErr w:type="spellEnd"/>
+      <w:r>
+        <w:rPr>
+          <w:rFonts w:ascii="Times New Roman" w:hAnsi="Times New Roman" w:cs="Times New Roman"/>
+          <w:i/>
+          <w:iCs/>
+          <w:sz w:val="20"/>
+          <w:szCs w:val="20"/>
+        </w:rPr>
+        <w:t xml:space="preserve">. Analysis of a sleep-dependent neuronal feedback loop: the slow-wave </w:t>
+      </w:r>
+      <w:proofErr w:type="spellStart"/>
+      <w:r>
+        <w:rPr>
+          <w:rFonts w:ascii="Times New Roman" w:hAnsi="Times New Roman" w:cs="Times New Roman"/>
+          <w:i/>
+          <w:iCs/>
+          <w:sz w:val="20"/>
+          <w:szCs w:val="20"/>
+        </w:rPr>
+        <w:t>microcontinuity</w:t>
+      </w:r>
+      <w:proofErr w:type="spellEnd"/>
+      <w:r>
+        <w:rPr>
+          <w:rFonts w:ascii="Times New Roman" w:hAnsi="Times New Roman" w:cs="Times New Roman"/>
+          <w:i/>
+          <w:iCs/>
+          <w:sz w:val="20"/>
+          <w:szCs w:val="20"/>
+        </w:rPr>
+        <w:t xml:space="preserve"> of the EEG. </w:t>
+      </w:r>
+      <w:r>
+        <w:rPr>
+          <w:rFonts w:ascii="Times New Roman" w:hAnsi="Times New Roman" w:cs="Times New Roman"/>
+          <w:i/>
+          <w:iCs/>
+          <w:sz w:val="20"/>
+          <w:szCs w:val="20"/>
+          <w:lang w:val="es-CO"/>
+        </w:rPr>
+        <w:t>IEEE-BME 47(9):1185-1194 (2000).</w:t>
       </w:r>
     </w:p>
     <w:p>
       <w:pPr>
-        <w:spacing w:after="120"/>
-        <w:rPr>
-          <w:rFonts w:ascii="Montserrat Light" w:hAnsi="Montserrat Light"/>
+        <w:jc w:val="both"/>
+        <w:rPr>
+          <w:rFonts w:ascii="Montserrat Light" w:hAnsi="Montserrat Light" w:cs="Arial"/>
+          <w:szCs w:val="21"/>
           <w:lang w:val="es-CO"/>
         </w:rPr>
       </w:pPr>
       <w:r>
         <w:rPr>
-          <w:rFonts w:ascii="Montserrat Light" w:hAnsi="Montserrat Light"/>
+          <w:rFonts w:ascii="Montserrat Light" w:hAnsi="Montserrat Light" w:cs="Arial"/>
+          <w:szCs w:val="21"/>
+          <w:lang w:val="es-CO"/>
+        </w:rPr>
+        <w:t xml:space="preserve">Para el desarrollo de este proyecto se utilizará el </w:t>
+      </w:r>
+      <w:r>
+        <w:rPr>
+          <w:rFonts w:ascii="Montserrat Light" w:hAnsi="Montserrat Light" w:cs="Arial"/>
           <w:b/>
-          <w:color w:val="444655"/>
-          <w:lang w:val="es-CO"/>
-        </w:rPr>
-        <w:t xml:space="preserve">Enlace: </w:t>
+          <w:bCs/>
+          <w:szCs w:val="21"/>
+          <w:lang w:val="es-CO"/>
+        </w:rPr>
+        <w:t xml:space="preserve">Sleep-EDF </w:t>
+      </w:r>
+      <w:proofErr w:type="spellStart"/>
+      <w:r>
+        <w:rPr>
+          <w:rFonts w:ascii="Montserrat Light" w:hAnsi="Montserrat Light" w:cs="Arial"/>
+          <w:b/>
+          <w:bCs/>
+          <w:szCs w:val="21"/>
+          <w:lang w:val="es-CO"/>
+        </w:rPr>
+        <w:t>Database</w:t>
+      </w:r>
+      <w:proofErr w:type="spellEnd"/>
+      <w:r>
+        <w:rPr>
+          <w:rFonts w:ascii="Montserrat Light" w:hAnsi="Montserrat Light" w:cs="Arial"/>
+          <w:b/>
+          <w:bCs/>
+          <w:szCs w:val="21"/>
+          <w:lang w:val="es-CO"/>
+        </w:rPr>
+        <w:t xml:space="preserve"> </w:t>
+      </w:r>
+      <w:proofErr w:type="spellStart"/>
+      <w:r>
+        <w:rPr>
+          <w:rFonts w:ascii="Montserrat Light" w:hAnsi="Montserrat Light" w:cs="Arial"/>
+          <w:b/>
+          <w:bCs/>
+          <w:szCs w:val="21"/>
+          <w:lang w:val="es-CO"/>
+        </w:rPr>
+        <w:t>Expanded</w:t>
+      </w:r>
+      <w:proofErr w:type="spellEnd"/>
+      <w:r>
+        <w:rPr>
+          <w:rFonts w:ascii="Montserrat Light" w:hAnsi="Montserrat Light" w:cs="Arial"/>
+          <w:b/>
+          <w:bCs/>
+          <w:szCs w:val="21"/>
+          <w:lang w:val="es-CO"/>
+        </w:rPr>
+        <w:t xml:space="preserve"> (Sleep-</w:t>
+      </w:r>
+      <w:proofErr w:type="spellStart"/>
+      <w:r>
+        <w:rPr>
+          <w:rFonts w:ascii="Montserrat Light" w:hAnsi="Montserrat Light" w:cs="Arial"/>
+          <w:b/>
+          <w:bCs/>
+          <w:szCs w:val="21"/>
+          <w:lang w:val="es-CO"/>
+        </w:rPr>
+        <w:t>EDFx</w:t>
+      </w:r>
+      <w:proofErr w:type="spellEnd"/>
+      <w:r>
+        <w:rPr>
+          <w:rFonts w:ascii="Montserrat Light" w:hAnsi="Montserrat Light" w:cs="Arial"/>
+          <w:b/>
+          <w:bCs/>
+          <w:szCs w:val="21"/>
+          <w:lang w:val="es-CO"/>
+        </w:rPr>
+        <w:t>)</w:t>
+      </w:r>
+      <w:r>
+        <w:rPr>
+          <w:rFonts w:ascii="Montserrat Light" w:hAnsi="Montserrat Light" w:cs="Arial"/>
+          <w:szCs w:val="21"/>
+          <w:lang w:val="es-CO"/>
+        </w:rPr>
+        <w:t xml:space="preserve">, un conjunto de datos de acceso público disponible en </w:t>
+      </w:r>
+      <w:proofErr w:type="spellStart"/>
+      <w:r>
+        <w:rPr>
+          <w:rFonts w:ascii="Montserrat Light" w:hAnsi="Montserrat Light" w:cs="Arial"/>
+          <w:szCs w:val="21"/>
+          <w:lang w:val="es-CO"/>
+        </w:rPr>
+        <w:t>PhysioNet</w:t>
+      </w:r>
+      <w:proofErr w:type="spellEnd"/>
+      <w:r>
+        <w:rPr>
+          <w:rFonts w:ascii="Montserrat Light" w:hAnsi="Montserrat Light" w:cs="Arial"/>
+          <w:szCs w:val="21"/>
+          <w:lang w:val="es-CO"/>
+        </w:rPr>
+        <w:t xml:space="preserve"> (</w:t>
+      </w:r>
+      <w:hyperlink r:id="rId10" w:anchor="files-panel" w:history="1">
+        <w:r>
+          <w:rPr>
+            <w:rStyle w:val="Hipervnculo"/>
+            <w:rFonts w:ascii="Montserrat Light" w:hAnsi="Montserrat Light" w:cs="Arial"/>
+            <w:szCs w:val="21"/>
+            <w:lang w:val="es-CO"/>
+          </w:rPr>
+          <w:t xml:space="preserve">Sleep-EDF </w:t>
+        </w:r>
+        <w:proofErr w:type="spellStart"/>
+        <w:r>
+          <w:rPr>
+            <w:rStyle w:val="Hipervnculo"/>
+            <w:rFonts w:ascii="Montserrat Light" w:hAnsi="Montserrat Light" w:cs="Arial"/>
+            <w:szCs w:val="21"/>
+            <w:lang w:val="es-CO"/>
+          </w:rPr>
+          <w:t>Database</w:t>
+        </w:r>
+        <w:proofErr w:type="spellEnd"/>
+        <w:r>
+          <w:rPr>
+            <w:rStyle w:val="Hipervnculo"/>
+            <w:rFonts w:ascii="Montserrat Light" w:hAnsi="Montserrat Light" w:cs="Arial"/>
+            <w:szCs w:val="21"/>
+            <w:lang w:val="es-CO"/>
+          </w:rPr>
+          <w:t xml:space="preserve"> </w:t>
+        </w:r>
+        <w:proofErr w:type="spellStart"/>
+        <w:r>
+          <w:rPr>
+            <w:rStyle w:val="Hipervnculo"/>
+            <w:rFonts w:ascii="Montserrat Light" w:hAnsi="Montserrat Light" w:cs="Arial"/>
+            <w:szCs w:val="21"/>
+            <w:lang w:val="es-CO"/>
+          </w:rPr>
+          <w:t>Expanded</w:t>
+        </w:r>
+        <w:proofErr w:type="spellEnd"/>
+      </w:hyperlink>
+      <w:r>
+        <w:rPr>
+          <w:rFonts w:ascii="Montserrat Light" w:hAnsi="Montserrat Light" w:cs="Arial"/>
+          <w:szCs w:val="21"/>
+          <w:lang w:val="es-CO"/>
+        </w:rPr>
+        <w:t>).</w:t>
       </w:r>
     </w:p>
     <w:p>
       <w:pPr>
-        <w:spacing w:after="120"/>
-        <w:rPr>
-          <w:rFonts w:ascii="Montserrat Light" w:hAnsi="Montserrat Light"/>
+        <w:jc w:val="both"/>
+        <w:rPr>
+          <w:rFonts w:ascii="Montserrat Light" w:hAnsi="Montserrat Light" w:cs="Arial"/>
+          <w:szCs w:val="21"/>
           <w:lang w:val="es-CO"/>
         </w:rPr>
       </w:pPr>
       <w:r>
+        <w:rPr>
+          <w:rFonts w:ascii="Montserrat Light" w:hAnsi="Montserrat Light" w:cs="Arial"/>
+          <w:b/>
+          <w:bCs/>
+          <w:szCs w:val="21"/>
+          <w:lang w:val="es-CO"/>
+        </w:rPr>
+        <w:t>Repositorio:</w:t>
+      </w:r>
+      <w:r>
+        <w:rPr>
+          <w:rFonts w:ascii="Montserrat Light" w:hAnsi="Montserrat Light" w:cs="Arial"/>
+          <w:szCs w:val="21"/>
+          <w:lang w:val="es-CO"/>
+        </w:rPr>
+        <w:t xml:space="preserve"> </w:t>
+      </w:r>
+      <w:hyperlink r:id="rId11" w:history="1">
+        <w:r>
+          <w:rPr>
+            <w:rStyle w:val="Hipervnculo"/>
+            <w:rFonts w:ascii="Montserrat Light" w:hAnsi="Montserrat Light" w:cs="Arial"/>
+            <w:szCs w:val="21"/>
+            <w:lang w:val="es-CO"/>
+          </w:rPr>
+          <w:t>https://github.com/Nicolasdgg/MicroP1MAIA</w:t>
+        </w:r>
+      </w:hyperlink>
+    </w:p>
+    <w:p>
+      <w:pPr>
+        <w:jc w:val="both"/>
+        <w:rPr>
+          <w:rFonts w:ascii="Montserrat Light" w:hAnsi="Montserrat Light" w:cs="Arial"/>
+          <w:szCs w:val="21"/>
+          <w:lang w:val="es-CO"/>
+        </w:rPr>
+      </w:pPr>
+      <w:r>
+        <w:rPr>
+          <w:rFonts w:ascii="Montserrat Light" w:hAnsi="Montserrat Light" w:cs="Arial"/>
+          <w:szCs w:val="21"/>
+          <w:lang w:val="es-CO"/>
+        </w:rPr>
+        <w:t>El conjunto contiene aproximadamente 197 estudios de sueño, divididos en dos subconjuntos:</w:t>
+      </w:r>
+    </w:p>
+    <w:p>
+      <w:pPr>
+        <w:numPr>
+          <w:ilvl w:val="0"/>
+          <w:numId w:val="10"/>
+        </w:numPr>
+        <w:spacing w:after="160" w:line="278" w:lineRule="auto"/>
+        <w:jc w:val="both"/>
+        <w:rPr>
+          <w:rFonts w:ascii="Montserrat Light" w:hAnsi="Montserrat Light" w:cs="Arial"/>
+          <w:szCs w:val="21"/>
+          <w:lang w:val="es-CO"/>
+        </w:rPr>
+      </w:pPr>
+      <w:r>
+        <w:rPr>
+          <w:rFonts w:ascii="Montserrat Light" w:hAnsi="Montserrat Light" w:cs="Arial"/>
+          <w:b/>
+          <w:bCs/>
+          <w:szCs w:val="21"/>
+          <w:lang w:val="es-CO"/>
+        </w:rPr>
+        <w:t>Sleep Cassette (SC):</w:t>
+      </w:r>
+      <w:r>
+        <w:rPr>
+          <w:rFonts w:ascii="Montserrat Light" w:hAnsi="Montserrat Light" w:cs="Arial"/>
+          <w:szCs w:val="21"/>
+          <w:lang w:val="es-CO"/>
+        </w:rPr>
+        <w:t xml:space="preserve"> 153 registros de estudios de sueño en casa de sujetos sanos de 25-101 años, obtenidos en un estudio sobre los efectos de la edad en el sueño.</w:t>
+      </w:r>
+    </w:p>
+    <w:p>
+      <w:pPr>
+        <w:numPr>
+          <w:ilvl w:val="0"/>
+          <w:numId w:val="10"/>
+        </w:numPr>
+        <w:spacing w:after="160" w:line="278" w:lineRule="auto"/>
+        <w:jc w:val="both"/>
+        <w:rPr>
+          <w:rFonts w:ascii="Montserrat Light" w:hAnsi="Montserrat Light" w:cs="Arial"/>
+          <w:szCs w:val="21"/>
+          <w:lang w:val="es-CO"/>
+        </w:rPr>
+      </w:pPr>
+      <w:r>
+        <w:rPr>
+          <w:rFonts w:ascii="Montserrat Light" w:hAnsi="Montserrat Light" w:cs="Arial"/>
+          <w:b/>
+          <w:bCs/>
+          <w:szCs w:val="21"/>
+          <w:lang w:val="es-CO"/>
+        </w:rPr>
+        <w:t xml:space="preserve">Sleep </w:t>
+      </w:r>
+      <w:proofErr w:type="spellStart"/>
+      <w:r>
+        <w:rPr>
+          <w:rFonts w:ascii="Montserrat Light" w:hAnsi="Montserrat Light" w:cs="Arial"/>
+          <w:b/>
+          <w:bCs/>
+          <w:szCs w:val="21"/>
+          <w:lang w:val="es-CO"/>
+        </w:rPr>
+        <w:t>Telemetry</w:t>
+      </w:r>
+      <w:proofErr w:type="spellEnd"/>
+      <w:r>
+        <w:rPr>
+          <w:rFonts w:ascii="Montserrat Light" w:hAnsi="Montserrat Light" w:cs="Arial"/>
+          <w:b/>
+          <w:bCs/>
+          <w:szCs w:val="21"/>
+          <w:lang w:val="es-CO"/>
+        </w:rPr>
+        <w:t xml:space="preserve"> (ST):</w:t>
+      </w:r>
+      <w:r>
+        <w:rPr>
+          <w:rFonts w:ascii="Montserrat Light" w:hAnsi="Montserrat Light" w:cs="Arial"/>
+          <w:szCs w:val="21"/>
+          <w:lang w:val="es-CO"/>
+        </w:rPr>
+        <w:t xml:space="preserve"> 44 registros de sujetos con leves dificultades para dormir tratados con </w:t>
+      </w:r>
+      <w:proofErr w:type="spellStart"/>
+      <w:r>
+        <w:rPr>
+          <w:rFonts w:ascii="Montserrat Light" w:hAnsi="Montserrat Light" w:cs="Arial"/>
+          <w:szCs w:val="21"/>
+          <w:lang w:val="es-CO"/>
+        </w:rPr>
+        <w:t>temazepam</w:t>
+      </w:r>
+      <w:proofErr w:type="spellEnd"/>
+      <w:r>
+        <w:rPr>
+          <w:rFonts w:ascii="Montserrat Light" w:hAnsi="Montserrat Light" w:cs="Arial"/>
+          <w:szCs w:val="21"/>
+          <w:lang w:val="es-CO"/>
+        </w:rPr>
+        <w:t>.</w:t>
+      </w:r>
+    </w:p>
+    <w:p>
+      <w:pPr>
+        <w:jc w:val="both"/>
+        <w:rPr>
+          <w:rFonts w:ascii="Montserrat Light" w:hAnsi="Montserrat Light" w:cs="Arial"/>
+          <w:szCs w:val="21"/>
+        </w:rPr>
+      </w:pPr>
+      <w:r>
+        <w:rPr>
+          <w:rFonts w:ascii="Montserrat Light" w:hAnsi="Montserrat Light" w:cs="Arial"/>
+          <w:szCs w:val="21"/>
+        </w:rPr>
+        <w:t xml:space="preserve">Cada </w:t>
+      </w:r>
+      <w:proofErr w:type="spellStart"/>
+      <w:r>
+        <w:rPr>
+          <w:rFonts w:ascii="Montserrat Light" w:hAnsi="Montserrat Light" w:cs="Arial"/>
+          <w:szCs w:val="21"/>
+        </w:rPr>
+        <w:t>registro</w:t>
+      </w:r>
+      <w:proofErr w:type="spellEnd"/>
+      <w:r>
+        <w:rPr>
+          <w:rFonts w:ascii="Montserrat Light" w:hAnsi="Montserrat Light" w:cs="Arial"/>
+          <w:szCs w:val="21"/>
+        </w:rPr>
+        <w:t xml:space="preserve"> </w:t>
+      </w:r>
+      <w:proofErr w:type="spellStart"/>
+      <w:r>
+        <w:rPr>
+          <w:rFonts w:ascii="Montserrat Light" w:hAnsi="Montserrat Light" w:cs="Arial"/>
+          <w:szCs w:val="21"/>
+        </w:rPr>
+        <w:t>incluye</w:t>
+      </w:r>
+      <w:proofErr w:type="spellEnd"/>
+      <w:r>
+        <w:rPr>
+          <w:rFonts w:ascii="Montserrat Light" w:hAnsi="Montserrat Light" w:cs="Arial"/>
+          <w:szCs w:val="21"/>
+        </w:rPr>
+        <w:t>:</w:t>
+      </w:r>
+    </w:p>
+    <w:p>
+      <w:pPr>
+        <w:numPr>
+          <w:ilvl w:val="0"/>
+          <w:numId w:val="11"/>
+        </w:numPr>
+        <w:spacing w:after="160" w:line="278" w:lineRule="auto"/>
+        <w:jc w:val="both"/>
+        <w:rPr>
+          <w:rFonts w:ascii="Montserrat Light" w:hAnsi="Montserrat Light" w:cs="Arial"/>
+          <w:szCs w:val="21"/>
+          <w:lang w:val="es-CO"/>
+        </w:rPr>
+      </w:pPr>
+      <w:r>
+        <w:rPr>
+          <w:rFonts w:ascii="Montserrat Light" w:hAnsi="Montserrat Light" w:cs="Arial"/>
+          <w:szCs w:val="21"/>
+          <w:lang w:val="es-CO"/>
+        </w:rPr>
+        <w:t>Al menos dos canales de EEG (</w:t>
+      </w:r>
+      <w:proofErr w:type="spellStart"/>
+      <w:r>
+        <w:rPr>
+          <w:rFonts w:ascii="Montserrat Light" w:hAnsi="Montserrat Light" w:cs="Arial"/>
+          <w:b/>
+          <w:bCs/>
+          <w:szCs w:val="21"/>
+          <w:lang w:val="es-CO"/>
+        </w:rPr>
+        <w:t>Fpz-Cz</w:t>
+      </w:r>
+      <w:proofErr w:type="spellEnd"/>
+      <w:r>
+        <w:rPr>
+          <w:rFonts w:ascii="Montserrat Light" w:hAnsi="Montserrat Light" w:cs="Arial"/>
+          <w:szCs w:val="21"/>
+          <w:lang w:val="es-CO"/>
+        </w:rPr>
+        <w:t xml:space="preserve"> y </w:t>
+      </w:r>
+      <w:proofErr w:type="spellStart"/>
+      <w:r>
+        <w:rPr>
+          <w:rFonts w:ascii="Montserrat Light" w:hAnsi="Montserrat Light" w:cs="Arial"/>
+          <w:b/>
+          <w:bCs/>
+          <w:szCs w:val="21"/>
+          <w:lang w:val="es-CO"/>
+        </w:rPr>
+        <w:t>Pz</w:t>
+      </w:r>
+      <w:proofErr w:type="spellEnd"/>
+      <w:r>
+        <w:rPr>
+          <w:rFonts w:ascii="Montserrat Light" w:hAnsi="Montserrat Light" w:cs="Arial"/>
+          <w:b/>
+          <w:bCs/>
+          <w:szCs w:val="21"/>
+          <w:lang w:val="es-CO"/>
+        </w:rPr>
+        <w:t>-Oz</w:t>
+      </w:r>
+      <w:r>
+        <w:rPr>
+          <w:rFonts w:ascii="Montserrat Light" w:hAnsi="Montserrat Light" w:cs="Arial"/>
+          <w:szCs w:val="21"/>
+          <w:lang w:val="es-CO"/>
+        </w:rPr>
+        <w:t>), muestreados a 100 Hz.</w:t>
+      </w:r>
+    </w:p>
+    <w:p>
+      <w:pPr>
+        <w:numPr>
+          <w:ilvl w:val="0"/>
+          <w:numId w:val="11"/>
+        </w:numPr>
+        <w:spacing w:after="160" w:line="278" w:lineRule="auto"/>
+        <w:jc w:val="both"/>
+        <w:rPr>
+          <w:rFonts w:ascii="Montserrat Light" w:hAnsi="Montserrat Light" w:cs="Arial"/>
+          <w:szCs w:val="21"/>
+          <w:lang w:val="es-CO"/>
+        </w:rPr>
+      </w:pPr>
+      <w:r>
+        <w:rPr>
+          <w:rFonts w:ascii="Montserrat Light" w:hAnsi="Montserrat Light" w:cs="Arial"/>
+          <w:szCs w:val="21"/>
+          <w:lang w:val="es-CO"/>
+        </w:rPr>
+        <w:t xml:space="preserve">Un canal de </w:t>
+      </w:r>
+      <w:r>
+        <w:rPr>
+          <w:rFonts w:ascii="Montserrat Light" w:hAnsi="Montserrat Light" w:cs="Arial"/>
+          <w:b/>
+          <w:bCs/>
+          <w:szCs w:val="21"/>
+          <w:lang w:val="es-CO"/>
+        </w:rPr>
+        <w:t>EOG</w:t>
+      </w:r>
+      <w:r>
+        <w:rPr>
+          <w:rFonts w:ascii="Montserrat Light" w:hAnsi="Montserrat Light" w:cs="Arial"/>
+          <w:szCs w:val="21"/>
+          <w:lang w:val="es-CO"/>
+        </w:rPr>
+        <w:t xml:space="preserve"> (</w:t>
+      </w:r>
+      <w:proofErr w:type="spellStart"/>
+      <w:r>
+        <w:rPr>
+          <w:rFonts w:ascii="Montserrat Light" w:hAnsi="Montserrat Light" w:cs="Arial"/>
+          <w:szCs w:val="21"/>
+          <w:lang w:val="es-CO"/>
+        </w:rPr>
+        <w:t>electrooculografía</w:t>
+      </w:r>
+      <w:proofErr w:type="spellEnd"/>
+      <w:r>
+        <w:rPr>
+          <w:rFonts w:ascii="Montserrat Light" w:hAnsi="Montserrat Light" w:cs="Arial"/>
+          <w:szCs w:val="21"/>
+          <w:lang w:val="es-CO"/>
+        </w:rPr>
+        <w:t>) horizontal.</w:t>
+      </w:r>
+    </w:p>
+    <w:p>
+      <w:pPr>
+        <w:numPr>
+          <w:ilvl w:val="0"/>
+          <w:numId w:val="11"/>
+        </w:numPr>
+        <w:spacing w:after="160" w:line="278" w:lineRule="auto"/>
+        <w:jc w:val="both"/>
+        <w:rPr>
+          <w:rFonts w:ascii="Montserrat Light" w:hAnsi="Montserrat Light" w:cs="Arial"/>
+          <w:szCs w:val="21"/>
+          <w:lang w:val="es-CO"/>
+        </w:rPr>
+      </w:pPr>
+      <w:r>
+        <w:rPr>
+          <w:rFonts w:ascii="Montserrat Light" w:hAnsi="Montserrat Light" w:cs="Arial"/>
+          <w:szCs w:val="21"/>
+          <w:lang w:val="es-CO"/>
+        </w:rPr>
+        <w:t xml:space="preserve">Un canal de </w:t>
+      </w:r>
+      <w:r>
+        <w:rPr>
+          <w:rFonts w:ascii="Montserrat Light" w:hAnsi="Montserrat Light" w:cs="Arial"/>
+          <w:b/>
+          <w:bCs/>
+          <w:szCs w:val="21"/>
+          <w:lang w:val="es-CO"/>
+        </w:rPr>
+        <w:t>EMG</w:t>
+      </w:r>
+      <w:r>
+        <w:rPr>
+          <w:rFonts w:ascii="Montserrat Light" w:hAnsi="Montserrat Light" w:cs="Arial"/>
+          <w:szCs w:val="21"/>
+          <w:lang w:val="es-CO"/>
+        </w:rPr>
+        <w:t xml:space="preserve"> submentoniano (en la mayoría de los registros).</w:t>
+      </w:r>
+    </w:p>
+    <w:p>
+      <w:pPr>
+        <w:numPr>
+          <w:ilvl w:val="0"/>
+          <w:numId w:val="11"/>
+        </w:numPr>
+        <w:spacing w:after="160" w:line="278" w:lineRule="auto"/>
+        <w:jc w:val="both"/>
+        <w:rPr>
+          <w:rFonts w:ascii="Montserrat Light" w:hAnsi="Montserrat Light" w:cs="Arial"/>
+          <w:szCs w:val="21"/>
+          <w:lang w:val="es-CO"/>
+        </w:rPr>
+      </w:pPr>
+      <w:r>
+        <w:rPr>
+          <w:rFonts w:ascii="Montserrat Light" w:hAnsi="Montserrat Light" w:cs="Arial"/>
+          <w:szCs w:val="21"/>
+          <w:lang w:val="es-CO"/>
+        </w:rPr>
+        <w:lastRenderedPageBreak/>
+        <w:t xml:space="preserve">Un </w:t>
+      </w:r>
+      <w:proofErr w:type="spellStart"/>
+      <w:r>
+        <w:rPr>
+          <w:rFonts w:ascii="Montserrat Light" w:hAnsi="Montserrat Light" w:cs="Arial"/>
+          <w:b/>
+          <w:bCs/>
+          <w:szCs w:val="21"/>
+          <w:lang w:val="es-CO"/>
+        </w:rPr>
+        <w:t>hipnograma</w:t>
+      </w:r>
+      <w:proofErr w:type="spellEnd"/>
+      <w:r>
+        <w:rPr>
+          <w:rFonts w:ascii="Montserrat Light" w:hAnsi="Montserrat Light" w:cs="Arial"/>
+          <w:szCs w:val="21"/>
+          <w:lang w:val="es-CO"/>
+        </w:rPr>
+        <w:t xml:space="preserve"> anotado manualmente por técnicos expertos según el manual </w:t>
+      </w:r>
+      <w:proofErr w:type="spellStart"/>
+      <w:r>
+        <w:rPr>
+          <w:rFonts w:ascii="Montserrat Light" w:hAnsi="Montserrat Light" w:cs="Arial"/>
+          <w:szCs w:val="21"/>
+          <w:lang w:val="es-CO"/>
+        </w:rPr>
+        <w:t>Rechtschaffen</w:t>
+      </w:r>
+      <w:proofErr w:type="spellEnd"/>
+      <w:r>
+        <w:rPr>
+          <w:rFonts w:ascii="Montserrat Light" w:hAnsi="Montserrat Light" w:cs="Arial"/>
+          <w:szCs w:val="21"/>
+          <w:lang w:val="es-CO"/>
+        </w:rPr>
+        <w:t xml:space="preserve"> &amp; Kales, que servirá como etiqueta (</w:t>
+      </w:r>
+      <w:proofErr w:type="spellStart"/>
+      <w:r>
+        <w:rPr>
+          <w:rFonts w:ascii="Montserrat Light" w:hAnsi="Montserrat Light" w:cs="Arial"/>
+          <w:szCs w:val="21"/>
+          <w:lang w:val="es-CO"/>
+        </w:rPr>
+        <w:t>ground</w:t>
+      </w:r>
+      <w:proofErr w:type="spellEnd"/>
+      <w:r>
+        <w:rPr>
+          <w:rFonts w:ascii="Montserrat Light" w:hAnsi="Montserrat Light" w:cs="Arial"/>
+          <w:szCs w:val="21"/>
+          <w:lang w:val="es-CO"/>
+        </w:rPr>
+        <w:t xml:space="preserve"> </w:t>
+      </w:r>
+      <w:proofErr w:type="spellStart"/>
+      <w:r>
+        <w:rPr>
+          <w:rFonts w:ascii="Montserrat Light" w:hAnsi="Montserrat Light" w:cs="Arial"/>
+          <w:szCs w:val="21"/>
+          <w:lang w:val="es-CO"/>
+        </w:rPr>
+        <w:t>truth</w:t>
+      </w:r>
+      <w:proofErr w:type="spellEnd"/>
+      <w:r>
+        <w:rPr>
+          <w:rFonts w:ascii="Montserrat Light" w:hAnsi="Montserrat Light" w:cs="Arial"/>
+          <w:szCs w:val="21"/>
+          <w:lang w:val="es-CO"/>
+        </w:rPr>
+        <w:t>) para el entrenamiento y evaluación de los modelos.</w:t>
+      </w:r>
+    </w:p>
+    <w:p>
+      <w:pPr>
+        <w:pBdr>
+          <w:bottom w:val="single" w:sz="8" w:space="4" w:color="5B57D1"/>
+        </w:pBdr>
+        <w:spacing w:before="360" w:after="120"/>
         <w:rPr>
           <w:rFonts w:ascii="Montserrat Light" w:hAnsi="Montserrat Light"/>
           <w:b/>
-          <w:color w:val="444655"/>
-          <w:lang w:val="es-CO"/>
-        </w:rPr>
-        <w:t xml:space="preserve">Tamaño / categorías / volumen: </w:t>
+          <w:color w:val="5B57D1"/>
+          <w:szCs w:val="21"/>
+          <w:lang w:val="es-CO"/>
+        </w:rPr>
+      </w:pPr>
+      <w:r>
+        <w:rPr>
+          <w:rFonts w:ascii="Montserrat Light" w:hAnsi="Montserrat Light" w:cs="Arial"/>
+          <w:szCs w:val="21"/>
+          <w:lang w:val="es-CO"/>
+        </w:rPr>
+        <w:t xml:space="preserve">Cada noche de registro dura entre 20 y 24 horas aproximadamente, segmentada en épocas de 30 segundos, lo que da un total estimado de </w:t>
       </w:r>
+      <w:r>
+        <w:rPr>
+          <w:rFonts w:ascii="Montserrat Light" w:hAnsi="Montserrat Light" w:cs="Arial"/>
+          <w:b/>
+          <w:bCs/>
+          <w:szCs w:val="21"/>
+          <w:lang w:val="es-CO"/>
+        </w:rPr>
+        <w:t>800 a 1,200 épocas etiquetadas por sujeto</w:t>
+      </w:r>
+    </w:p>
+    <w:p>
+      <w:pPr>
+        <w:pBdr>
+          <w:bottom w:val="single" w:sz="8" w:space="4" w:color="5B57D1"/>
+        </w:pBdr>
+        <w:spacing w:before="360" w:after="120"/>
+        <w:rPr>
+          <w:rFonts w:ascii="Montserrat SemiBold" w:hAnsi="Montserrat SemiBold"/>
+          <w:b/>
+          <w:color w:val="5B57D1"/>
+          <w:sz w:val="30"/>
+          <w:lang w:val="es-CO"/>
+        </w:rPr>
+      </w:pPr>
     </w:p>
     <w:p>
       <w:pPr>
@@ -1668,7 +2378,6 @@
           <w:sz w:val="30"/>
           <w:lang w:val="es-CO"/>
         </w:rPr>
-        <w:lastRenderedPageBreak/>
         <w:t>Maqueta del prototipo</w:t>
       </w:r>
     </w:p>
@@ -1686,6 +2395,7 @@
           <w:noProof/>
           <w:lang w:val="es-CO"/>
         </w:rPr>
+        <w:lastRenderedPageBreak/>
         <w:drawing>
           <wp:inline distT="0" distB="0" distL="0" distR="0" wp14:anchorId="1E907EF7" wp14:editId="28639539">
             <wp:extent cx="5580000" cy="3313125"/>
@@ -1702,7 +2412,7 @@
                     <pic:cNvPicPr/>
                   </pic:nvPicPr>
                   <pic:blipFill>
-                    <a:blip r:embed="rId10"/>
+                    <a:blip r:embed="rId12"/>
                     <a:stretch>
                       <a:fillRect/>
                     </a:stretch>
@@ -1876,23 +2586,7 @@
           <w:rFonts w:ascii="Montserrat Light" w:hAnsi="Montserrat Light"/>
           <w:lang w:val="es-CO"/>
         </w:rPr>
-        <w:t>) y chips de calidad de datos (épocas “</w:t>
-      </w:r>
-      <w:proofErr w:type="gramStart"/>
-      <w:r>
-        <w:rPr>
-          <w:rFonts w:ascii="Montserrat Light" w:hAnsi="Montserrat Light"/>
-          <w:lang w:val="es-CO"/>
-        </w:rPr>
-        <w:t>M”/</w:t>
-      </w:r>
-      <w:proofErr w:type="gramEnd"/>
-      <w:r>
-        <w:rPr>
-          <w:rFonts w:ascii="Montserrat Light" w:hAnsi="Montserrat Light"/>
-          <w:lang w:val="es-CO"/>
-        </w:rPr>
-        <w:t>“?” excluidas), para no ocultar problemas de calidad de los datos frente al usuario.</w:t>
+        <w:t>) y chips de calidad de datos (épocas “M”/“?” excluidas), para no ocultar problemas de calidad de los datos frente al usuario.</w:t>
       </w:r>
     </w:p>
     <w:p>
@@ -2044,7 +2738,6 @@
           <w:color w:val="444655"/>
           <w:lang w:val="es-CO"/>
         </w:rPr>
-        <w:lastRenderedPageBreak/>
         <w:t xml:space="preserve">Repositorio GitHub: </w:t>
       </w:r>
     </w:p>
@@ -2092,6 +2785,7 @@
           <w:color w:val="444655"/>
           <w:lang w:val="es-CO"/>
         </w:rPr>
+        <w:lastRenderedPageBreak/>
         <w:t xml:space="preserve">Infraestructura utilizada: </w:t>
       </w:r>
     </w:p>
@@ -2230,7 +2924,7 @@
       </w:pPr>
     </w:p>
     <w:sectPr>
-      <w:footerReference w:type="default" r:id="rId11"/>
+      <w:footerReference w:type="default" r:id="rId13"/>
       <w:pgSz w:w="12240" w:h="15840"/>
       <w:pgMar w:top="1134" w:right="1247" w:bottom="1134" w:left="1247" w:header="720" w:footer="720" w:gutter="0"/>
       <w:pgNumType w:start="0"/>
@@ -2243,7 +2937,7 @@
 </file>
 
 <file path=word/endnotes.xml><?xml version="1.0" encoding="utf-8"?>
-<w:endnotes xmlns:wpc="http://schemas.microsoft.com/office/word/2010/wordprocessingCanvas" xmlns:cx="http://schemas.microsoft.com/office/drawing/2014/chartex" xmlns:cx1="http://schemas.microsoft.com/office/drawing/2015/9/8/chartex" xmlns:cx2="http://schemas.microsoft.com/office/drawing/2015/10/21/chartex" xmlns:cx3="http://schemas.microsoft.com/office/drawing/2016/5/9/chartex" xmlns:cx4="http://schemas.microsoft.com/office/drawing/2016/5/10/chartex" xmlns:cx5="http://schemas.microsoft.com/office/drawing/2016/5/11/chartex" xmlns:cx6="http://schemas.microsoft.com/office/drawing/2016/5/12/chartex" xmlns:cx7="http://schemas.microsoft.com/office/drawing/2016/5/13/chartex" xmlns:cx8="http://schemas.microsoft.com/office/drawing/2016/5/14/chartex" xmlns:mc="http://schemas.openxmlformats.org/markup-compatibility/2006" xmlns:aink="http://schemas.microsoft.com/office/drawing/2016/ink" xmlns:am3d="http://schemas.microsoft.com/office/drawing/2017/model3d" xmlns:o="urn:schemas-microsoft-com:office:office" xmlns:oel="http://schemas.microsoft.com/office/2019/extlst" xmlns:r="http://schemas.openxmlformats.org/officeDocument/2006/relationships" xmlns:m="http://schemas.openxmlformats.org/officeDocument/2006/math" xmlns:v="urn:schemas-microsoft-com:vml" xmlns:wp14="http://schemas.microsoft.com/office/word/2010/wordprocessingDrawing" xmlns:wp="http://schemas.openxmlformats.org/drawingml/2006/wordprocessingDrawing" xmlns:w10="urn:schemas-microsoft-com:office:word" xmlns:w="http://schemas.openxmlformats.org/wordprocessingml/2006/main" xmlns:w14="http://schemas.microsoft.com/office/word/2010/wordml" xmlns:w15="http://schemas.microsoft.com/office/word/2012/wordml" xmlns:w16cex="http://schemas.microsoft.com/office/word/2018/wordml/cex" xmlns:w16cid="http://schemas.microsoft.com/office/word/2016/wordml/cid" xmlns:w16="http://schemas.microsoft.com/office/word/2018/wordml" xmlns:w16sdtdh="http://schemas.microsoft.com/office/word/2020/wordml/sdtdatahash" xmlns:w16se="http://schemas.microsoft.com/office/word/2015/wordml/symex" xmlns:wpg="http://schemas.microsoft.com/office/word/2010/wordprocessingGroup" xmlns:wpi="http://schemas.microsoft.com/office/word/2010/wordprocessingInk" xmlns:wne="http://schemas.microsoft.com/office/word/2006/wordml" xmlns:wps="http://schemas.microsoft.com/office/word/2010/wordprocessingShape" mc:Ignorable="w14 w15 w16se w16cid w16 w16cex w16sdtdh wp14">
+<w:endnotes xmlns:wpc="http://schemas.microsoft.com/office/word/2010/wordprocessingCanvas" xmlns:cx="http://schemas.microsoft.com/office/drawing/2014/chartex" xmlns:cx1="http://schemas.microsoft.com/office/drawing/2015/9/8/chartex" xmlns:cx2="http://schemas.microsoft.com/office/drawing/2015/10/21/chartex" xmlns:cx3="http://schemas.microsoft.com/office/drawing/2016/5/9/chartex" xmlns:cx4="http://schemas.microsoft.com/office/drawing/2016/5/10/chartex" xmlns:cx5="http://schemas.microsoft.com/office/drawing/2016/5/11/chartex" xmlns:cx6="http://schemas.microsoft.com/office/drawing/2016/5/12/chartex" xmlns:cx7="http://schemas.microsoft.com/office/drawing/2016/5/13/chartex" xmlns:cx8="http://schemas.microsoft.com/office/drawing/2016/5/14/chartex" xmlns:mc="http://schemas.openxmlformats.org/markup-compatibility/2006" xmlns:aink="http://schemas.microsoft.com/office/drawing/2016/ink" xmlns:am3d="http://schemas.microsoft.com/office/drawing/2017/model3d" xmlns:o="urn:schemas-microsoft-com:office:office" xmlns:oel="http://schemas.microsoft.com/office/2019/extlst" xmlns:r="http://schemas.openxmlformats.org/officeDocument/2006/relationships" xmlns:m="http://schemas.openxmlformats.org/officeDocument/2006/math" xmlns:v="urn:schemas-microsoft-com:vml" xmlns:wp14="http://schemas.microsoft.com/office/word/2010/wordprocessingDrawing" xmlns:wp="http://schemas.openxmlformats.org/drawingml/2006/wordprocessingDrawing" xmlns:w10="urn:schemas-microsoft-com:office:word" xmlns:w="http://schemas.openxmlformats.org/wordprocessingml/2006/main" xmlns:w14="http://schemas.microsoft.com/office/word/2010/wordml" xmlns:w15="http://schemas.microsoft.com/office/word/2012/wordml" xmlns:w16cei="http://schemas.microsoft.com/office/word/2026/wordml/cei" xmlns:w16cex="http://schemas.microsoft.com/office/word/2018/wordml/cex" xmlns:w16cid="http://schemas.microsoft.com/office/word/2016/wordml/cid" xmlns:w16="http://schemas.microsoft.com/office/word/2018/wordml" xmlns:w16du="http://schemas.microsoft.com/office/word/2023/wordml/word16du" xmlns:w16sdtdh="http://schemas.microsoft.com/office/word/2020/wordml/sdtdatahash" xmlns:w16sdtfl="http://schemas.microsoft.com/office/word/2024/wordml/sdtformatlock" xmlns:w16se="http://schemas.microsoft.com/office/word/2015/wordml/symex" xmlns:wpg="http://schemas.microsoft.com/office/word/2010/wordprocessingGroup" xmlns:wpi="http://schemas.microsoft.com/office/word/2010/wordprocessingInk" xmlns:wne="http://schemas.microsoft.com/office/word/2006/wordml" xmlns:wps="http://schemas.microsoft.com/office/word/2010/wordprocessingShape" mc:Ignorable="w14 w15 w16se w16cid w16 w16cex w16sdtdh w16sdtfl w16du wp14">
   <w:endnote w:type="separator" w:id="-1">
     <w:p>
       <w:pPr>
@@ -2268,12 +2962,15 @@
 </file>
 
 <file path=word/footer1.xml><?xml version="1.0" encoding="utf-8"?>
-<w:ftr xmlns:wpc="http://schemas.microsoft.com/office/word/2010/wordprocessingCanvas" xmlns:cx="http://schemas.microsoft.com/office/drawing/2014/chartex" xmlns:cx1="http://schemas.microsoft.com/office/drawing/2015/9/8/chartex" xmlns:cx2="http://schemas.microsoft.com/office/drawing/2015/10/21/chartex" xmlns:cx3="http://schemas.microsoft.com/office/drawing/2016/5/9/chartex" xmlns:cx4="http://schemas.microsoft.com/office/drawing/2016/5/10/chartex" xmlns:cx5="http://schemas.microsoft.com/office/drawing/2016/5/11/chartex" xmlns:cx6="http://schemas.microsoft.com/office/drawing/2016/5/12/chartex" xmlns:cx7="http://schemas.microsoft.com/office/drawing/2016/5/13/chartex" xmlns:cx8="http://schemas.microsoft.com/office/drawing/2016/5/14/chartex" xmlns:mc="http://schemas.openxmlformats.org/markup-compatibility/2006" xmlns:aink="http://schemas.microsoft.com/office/drawing/2016/ink" xmlns:am3d="http://schemas.microsoft.com/office/drawing/2017/model3d" xmlns:o="urn:schemas-microsoft-com:office:office" xmlns:oel="http://schemas.microsoft.com/office/2019/extlst" xmlns:r="http://schemas.openxmlformats.org/officeDocument/2006/relationships" xmlns:m="http://schemas.openxmlformats.org/officeDocument/2006/math" xmlns:v="urn:schemas-microsoft-com:vml" xmlns:wp14="http://schemas.microsoft.com/office/word/2010/wordprocessingDrawing" xmlns:wp="http://schemas.openxmlformats.org/drawingml/2006/wordprocessingDrawing" xmlns:w10="urn:schemas-microsoft-com:office:word" xmlns:w="http://schemas.openxmlformats.org/wordprocessingml/2006/main" xmlns:w14="http://schemas.microsoft.com/office/word/2010/wordml" xmlns:w15="http://schemas.microsoft.com/office/word/2012/wordml" xmlns:w16cex="http://schemas.microsoft.com/office/word/2018/wordml/cex" xmlns:w16cid="http://schemas.microsoft.com/office/word/2016/wordml/cid" xmlns:w16="http://schemas.microsoft.com/office/word/2018/wordml" xmlns:w16sdtdh="http://schemas.microsoft.com/office/word/2020/wordml/sdtdatahash" xmlns:w16se="http://schemas.microsoft.com/office/word/2015/wordml/symex" xmlns:wpg="http://schemas.microsoft.com/office/word/2010/wordprocessingGroup" xmlns:wpi="http://schemas.microsoft.com/office/word/2010/wordprocessingInk" xmlns:wne="http://schemas.microsoft.com/office/word/2006/wordml" xmlns:wps="http://schemas.microsoft.com/office/word/2010/wordprocessingShape" mc:Ignorable="w14 w15 w16se w16cid w16 w16cex w16sdtdh wp14">
+<w:ftr xmlns:wpc="http://schemas.microsoft.com/office/word/2010/wordprocessingCanvas" xmlns:cx="http://schemas.microsoft.com/office/drawing/2014/chartex" xmlns:cx1="http://schemas.microsoft.com/office/drawing/2015/9/8/chartex" xmlns:cx2="http://schemas.microsoft.com/office/drawing/2015/10/21/chartex" xmlns:cx3="http://schemas.microsoft.com/office/drawing/2016/5/9/chartex" xmlns:cx4="http://schemas.microsoft.com/office/drawing/2016/5/10/chartex" xmlns:cx5="http://schemas.microsoft.com/office/drawing/2016/5/11/chartex" xmlns:cx6="http://schemas.microsoft.com/office/drawing/2016/5/12/chartex" xmlns:cx7="http://schemas.microsoft.com/office/drawing/2016/5/13/chartex" xmlns:cx8="http://schemas.microsoft.com/office/drawing/2016/5/14/chartex" xmlns:mc="http://schemas.openxmlformats.org/markup-compatibility/2006" xmlns:aink="http://schemas.microsoft.com/office/drawing/2016/ink" xmlns:am3d="http://schemas.microsoft.com/office/drawing/2017/model3d" xmlns:o="urn:schemas-microsoft-com:office:office" xmlns:oel="http://schemas.microsoft.com/office/2019/extlst" xmlns:r="http://schemas.openxmlformats.org/officeDocument/2006/relationships" xmlns:m="http://schemas.openxmlformats.org/officeDocument/2006/math" xmlns:v="urn:schemas-microsoft-com:vml" xmlns:wp14="http://schemas.microsoft.com/office/word/2010/wordprocessingDrawing" xmlns:wp="http://schemas.openxmlformats.org/drawingml/2006/wordprocessingDrawing" xmlns:w10="urn:schemas-microsoft-com:office:word" xmlns:w="http://schemas.openxmlformats.org/wordprocessingml/2006/main" xmlns:w14="http://schemas.microsoft.com/office/word/2010/wordml" xmlns:w15="http://schemas.microsoft.com/office/word/2012/wordml" xmlns:w16cei="http://schemas.microsoft.com/office/word/2026/wordml/cei" xmlns:w16cex="http://schemas.microsoft.com/office/word/2018/wordml/cex" xmlns:w16cid="http://schemas.microsoft.com/office/word/2016/wordml/cid" xmlns:w16="http://schemas.microsoft.com/office/word/2018/wordml" xmlns:w16du="http://schemas.microsoft.com/office/word/2023/wordml/word16du" xmlns:w16sdtdh="http://schemas.microsoft.com/office/word/2020/wordml/sdtdatahash" xmlns:w16sdtfl="http://schemas.microsoft.com/office/word/2024/wordml/sdtformatlock" xmlns:w16se="http://schemas.microsoft.com/office/word/2015/wordml/symex" xmlns:wpg="http://schemas.microsoft.com/office/word/2010/wordprocessingGroup" xmlns:wpi="http://schemas.microsoft.com/office/word/2010/wordprocessingInk" xmlns:wne="http://schemas.microsoft.com/office/word/2006/wordml" xmlns:wps="http://schemas.microsoft.com/office/word/2010/wordprocessingShape" mc:Ignorable="w14 w15 w16se w16cid w16 w16cex w16sdtdh w16sdtfl w16du wp14">
   <w:p>
     <w:pPr>
       <w:pStyle w:val="Piedepgina"/>
     </w:pPr>
     <w:r>
+      <w:rPr>
+        <w:noProof/>
+      </w:rPr>
       <w:drawing>
         <wp:anchor distT="0" distB="0" distL="114300" distR="114300" simplePos="0" relativeHeight="251658240" behindDoc="1" locked="0" layoutInCell="1" allowOverlap="1" wp14:anchorId="7BE4FDD5" wp14:editId="5E67B023">
           <wp:simplePos x="0" y="0"/>
@@ -2337,7 +3034,7 @@
 </file>
 
 <file path=word/footnotes.xml><?xml version="1.0" encoding="utf-8"?>
-<w:footnotes xmlns:wpc="http://schemas.microsoft.com/office/word/2010/wordprocessingCanvas" xmlns:cx="http://schemas.microsoft.com/office/drawing/2014/chartex" xmlns:cx1="http://schemas.microsoft.com/office/drawing/2015/9/8/chartex" xmlns:cx2="http://schemas.microsoft.com/office/drawing/2015/10/21/chartex" xmlns:cx3="http://schemas.microsoft.com/office/drawing/2016/5/9/chartex" xmlns:cx4="http://schemas.microsoft.com/office/drawing/2016/5/10/chartex" xmlns:cx5="http://schemas.microsoft.com/office/drawing/2016/5/11/chartex" xmlns:cx6="http://schemas.microsoft.com/office/drawing/2016/5/12/chartex" xmlns:cx7="http://schemas.microsoft.com/office/drawing/2016/5/13/chartex" xmlns:cx8="http://schemas.microsoft.com/office/drawing/2016/5/14/chartex" xmlns:mc="http://schemas.openxmlformats.org/markup-compatibility/2006" xmlns:aink="http://schemas.microsoft.com/office/drawing/2016/ink" xmlns:am3d="http://schemas.microsoft.com/office/drawing/2017/model3d" xmlns:o="urn:schemas-microsoft-com:office:office" xmlns:oel="http://schemas.microsoft.com/office/2019/extlst" xmlns:r="http://schemas.openxmlformats.org/officeDocument/2006/relationships" xmlns:m="http://schemas.openxmlformats.org/officeDocument/2006/math" xmlns:v="urn:schemas-microsoft-com:vml" xmlns:wp14="http://schemas.microsoft.com/office/word/2010/wordprocessingDrawing" xmlns:wp="http://schemas.openxmlformats.org/drawingml/2006/wordprocessingDrawing" xmlns:w10="urn:schemas-microsoft-com:office:word" xmlns:w="http://schemas.openxmlformats.org/wordprocessingml/2006/main" xmlns:w14="http://schemas.microsoft.com/office/word/2010/wordml" xmlns:w15="http://schemas.microsoft.com/office/word/2012/wordml" xmlns:w16cex="http://schemas.microsoft.com/office/word/2018/wordml/cex" xmlns:w16cid="http://schemas.microsoft.com/office/word/2016/wordml/cid" xmlns:w16="http://schemas.microsoft.com/office/word/2018/wordml" xmlns:w16sdtdh="http://schemas.microsoft.com/office/word/2020/wordml/sdtdatahash" xmlns:w16se="http://schemas.microsoft.com/office/word/2015/wordml/symex" xmlns:wpg="http://schemas.microsoft.com/office/word/2010/wordprocessingGroup" xmlns:wpi="http://schemas.microsoft.com/office/word/2010/wordprocessingInk" xmlns:wne="http://schemas.microsoft.com/office/word/2006/wordml" xmlns:wps="http://schemas.microsoft.com/office/word/2010/wordprocessingShape" mc:Ignorable="w14 w15 w16se w16cid w16 w16cex w16sdtdh wp14">
+<w:footnotes xmlns:wpc="http://schemas.microsoft.com/office/word/2010/wordprocessingCanvas" xmlns:cx="http://schemas.microsoft.com/office/drawing/2014/chartex" xmlns:cx1="http://schemas.microsoft.com/office/drawing/2015/9/8/chartex" xmlns:cx2="http://schemas.microsoft.com/office/drawing/2015/10/21/chartex" xmlns:cx3="http://schemas.microsoft.com/office/drawing/2016/5/9/chartex" xmlns:cx4="http://schemas.microsoft.com/office/drawing/2016/5/10/chartex" xmlns:cx5="http://schemas.microsoft.com/office/drawing/2016/5/11/chartex" xmlns:cx6="http://schemas.microsoft.com/office/drawing/2016/5/12/chartex" xmlns:cx7="http://schemas.microsoft.com/office/drawing/2016/5/13/chartex" xmlns:cx8="http://schemas.microsoft.com/office/drawing/2016/5/14/chartex" xmlns:mc="http://schemas.openxmlformats.org/markup-compatibility/2006" xmlns:aink="http://schemas.microsoft.com/office/drawing/2016/ink" xmlns:am3d="http://schemas.microsoft.com/office/drawing/2017/model3d" xmlns:o="urn:schemas-microsoft-com:office:office" xmlns:oel="http://schemas.microsoft.com/office/2019/extlst" xmlns:r="http://schemas.openxmlformats.org/officeDocument/2006/relationships" xmlns:m="http://schemas.openxmlformats.org/officeDocument/2006/math" xmlns:v="urn:schemas-microsoft-com:vml" xmlns:wp14="http://schemas.microsoft.com/office/word/2010/wordprocessingDrawing" xmlns:wp="http://schemas.openxmlformats.org/drawingml/2006/wordprocessingDrawing" xmlns:w10="urn:schemas-microsoft-com:office:word" xmlns:w="http://schemas.openxmlformats.org/wordprocessingml/2006/main" xmlns:w14="http://schemas.microsoft.com/office/word/2010/wordml" xmlns:w15="http://schemas.microsoft.com/office/word/2012/wordml" xmlns:w16cei="http://schemas.microsoft.com/office/word/2026/wordml/cei" xmlns:w16cex="http://schemas.microsoft.com/office/word/2018/wordml/cex" xmlns:w16cid="http://schemas.microsoft.com/office/word/2016/wordml/cid" xmlns:w16="http://schemas.microsoft.com/office/word/2018/wordml" xmlns:w16du="http://schemas.microsoft.com/office/word/2023/wordml/word16du" xmlns:w16sdtdh="http://schemas.microsoft.com/office/word/2020/wordml/sdtdatahash" xmlns:w16sdtfl="http://schemas.microsoft.com/office/word/2024/wordml/sdtformatlock" xmlns:w16se="http://schemas.microsoft.com/office/word/2015/wordml/symex" xmlns:wpg="http://schemas.microsoft.com/office/word/2010/wordprocessingGroup" xmlns:wpi="http://schemas.microsoft.com/office/word/2010/wordprocessingInk" xmlns:wne="http://schemas.microsoft.com/office/word/2006/wordml" xmlns:wps="http://schemas.microsoft.com/office/word/2010/wordprocessingShape" mc:Ignorable="w14 w15 w16se w16cid w16 w16cex w16sdtdh w16sdtfl w16du wp14">
   <w:footnote w:type="separator" w:id="-1">
     <w:p>
       <w:pPr>
@@ -2362,7 +3059,7 @@
 </file>
 
 <file path=word/numbering.xml><?xml version="1.0" encoding="utf-8"?>
-<w:numbering xmlns:wpc="http://schemas.microsoft.com/office/word/2010/wordprocessingCanvas" xmlns:cx="http://schemas.microsoft.com/office/drawing/2014/chartex" xmlns:cx1="http://schemas.microsoft.com/office/drawing/2015/9/8/chartex" xmlns:cx2="http://schemas.microsoft.com/office/drawing/2015/10/21/chartex" xmlns:cx3="http://schemas.microsoft.com/office/drawing/2016/5/9/chartex" xmlns:cx4="http://schemas.microsoft.com/office/drawing/2016/5/10/chartex" xmlns:cx5="http://schemas.microsoft.com/office/drawing/2016/5/11/chartex" xmlns:cx6="http://schemas.microsoft.com/office/drawing/2016/5/12/chartex" xmlns:cx7="http://schemas.microsoft.com/office/drawing/2016/5/13/chartex" xmlns:cx8="http://schemas.microsoft.com/office/drawing/2016/5/14/chartex" xmlns:mc="http://schemas.openxmlformats.org/markup-compatibility/2006" xmlns:aink="http://schemas.microsoft.com/office/drawing/2016/ink" xmlns:am3d="http://schemas.microsoft.com/office/drawing/2017/model3d" xmlns:o="urn:schemas-microsoft-com:office:office" xmlns:oel="http://schemas.microsoft.com/office/2019/extlst" xmlns:r="http://schemas.openxmlformats.org/officeDocument/2006/relationships" xmlns:m="http://schemas.openxmlformats.org/officeDocument/2006/math" xmlns:v="urn:schemas-microsoft-com:vml" xmlns:wp14="http://schemas.microsoft.com/office/word/2010/wordprocessingDrawing" xmlns:wp="http://schemas.openxmlformats.org/drawingml/2006/wordprocessingDrawing" xmlns:w10="urn:schemas-microsoft-com:office:word" xmlns:w="http://schemas.openxmlformats.org/wordprocessingml/2006/main" xmlns:w14="http://schemas.microsoft.com/office/word/2010/wordml" xmlns:w15="http://schemas.microsoft.com/office/word/2012/wordml" xmlns:w16cex="http://schemas.microsoft.com/office/word/2018/wordml/cex" xmlns:w16cid="http://schemas.microsoft.com/office/word/2016/wordml/cid" xmlns:w16="http://schemas.microsoft.com/office/word/2018/wordml" xmlns:w16sdtdh="http://schemas.microsoft.com/office/word/2020/wordml/sdtdatahash" xmlns:w16se="http://schemas.microsoft.com/office/word/2015/wordml/symex" xmlns:wpg="http://schemas.microsoft.com/office/word/2010/wordprocessingGroup" xmlns:wpi="http://schemas.microsoft.com/office/word/2010/wordprocessingInk" xmlns:wne="http://schemas.microsoft.com/office/word/2006/wordml" xmlns:wps="http://schemas.microsoft.com/office/word/2010/wordprocessingShape" mc:Ignorable="w14 w15 w16se w16cid w16 w16cex w16sdtdh wp14">
+<w:numbering xmlns:wpc="http://schemas.microsoft.com/office/word/2010/wordprocessingCanvas" xmlns:cx="http://schemas.microsoft.com/office/drawing/2014/chartex" xmlns:cx1="http://schemas.microsoft.com/office/drawing/2015/9/8/chartex" xmlns:cx2="http://schemas.microsoft.com/office/drawing/2015/10/21/chartex" xmlns:cx3="http://schemas.microsoft.com/office/drawing/2016/5/9/chartex" xmlns:cx4="http://schemas.microsoft.com/office/drawing/2016/5/10/chartex" xmlns:cx5="http://schemas.microsoft.com/office/drawing/2016/5/11/chartex" xmlns:cx6="http://schemas.microsoft.com/office/drawing/2016/5/12/chartex" xmlns:cx7="http://schemas.microsoft.com/office/drawing/2016/5/13/chartex" xmlns:cx8="http://schemas.microsoft.com/office/drawing/2016/5/14/chartex" xmlns:mc="http://schemas.openxmlformats.org/markup-compatibility/2006" xmlns:aink="http://schemas.microsoft.com/office/drawing/2016/ink" xmlns:am3d="http://schemas.microsoft.com/office/drawing/2017/model3d" xmlns:o="urn:schemas-microsoft-com:office:office" xmlns:oel="http://schemas.microsoft.com/office/2019/extlst" xmlns:r="http://schemas.openxmlformats.org/officeDocument/2006/relationships" xmlns:m="http://schemas.openxmlformats.org/officeDocument/2006/math" xmlns:v="urn:schemas-microsoft-com:vml" xmlns:wp14="http://schemas.microsoft.com/office/word/2010/wordprocessingDrawing" xmlns:wp="http://schemas.openxmlformats.org/drawingml/2006/wordprocessingDrawing" xmlns:w10="urn:schemas-microsoft-com:office:word" xmlns:w="http://schemas.openxmlformats.org/wordprocessingml/2006/main" xmlns:w14="http://schemas.microsoft.com/office/word/2010/wordml" xmlns:w15="http://schemas.microsoft.com/office/word/2012/wordml" xmlns:w16cei="http://schemas.microsoft.com/office/word/2026/wordml/cei" xmlns:w16cex="http://schemas.microsoft.com/office/word/2018/wordml/cex" xmlns:w16cid="http://schemas.microsoft.com/office/word/2016/wordml/cid" xmlns:w16="http://schemas.microsoft.com/office/word/2018/wordml" xmlns:w16du="http://schemas.microsoft.com/office/word/2023/wordml/word16du" xmlns:w16sdtdh="http://schemas.microsoft.com/office/word/2020/wordml/sdtdatahash" xmlns:w16sdtfl="http://schemas.microsoft.com/office/word/2024/wordml/sdtformatlock" xmlns:w16se="http://schemas.microsoft.com/office/word/2015/wordml/symex" xmlns:wpg="http://schemas.microsoft.com/office/word/2010/wordprocessingGroup" xmlns:wpi="http://schemas.microsoft.com/office/word/2010/wordprocessingInk" xmlns:wne="http://schemas.microsoft.com/office/word/2006/wordml" xmlns:wps="http://schemas.microsoft.com/office/word/2010/wordprocessingShape" mc:Ignorable="w14 w15 w16se w16cid w16 w16cex w16sdtdh w16sdtfl w16du wp14">
   <w:abstractNum w:abstractNumId="0" w15:restartNumberingAfterBreak="0">
     <w:nsid w:val="FFFFFF7C"/>
     <w:multiLevelType w:val="singleLevel"/>
@@ -2531,6 +3228,304 @@
       </w:pPr>
       <w:rPr>
         <w:rFonts w:ascii="Symbol" w:hAnsi="Symbol" w:hint="default"/>
+      </w:rPr>
+    </w:lvl>
+  </w:abstractNum>
+  <w:abstractNum w:abstractNumId="9" w15:restartNumberingAfterBreak="0">
+    <w:nsid w:val="12020A07"/>
+    <w:multiLevelType w:val="multilevel"/>
+    <w:tmpl w:val="99AA8714"/>
+    <w:lvl w:ilvl="0">
+      <w:start w:val="1"/>
+      <w:numFmt w:val="bullet"/>
+      <w:lvlText w:val=""/>
+      <w:lvlJc w:val="left"/>
+      <w:pPr>
+        <w:tabs>
+          <w:tab w:val="num" w:pos="720"/>
+        </w:tabs>
+        <w:ind w:left="720" w:hanging="360"/>
+      </w:pPr>
+      <w:rPr>
+        <w:rFonts w:ascii="Symbol" w:hAnsi="Symbol" w:hint="default"/>
+        <w:sz w:val="20"/>
+      </w:rPr>
+    </w:lvl>
+    <w:lvl w:ilvl="1" w:tentative="1">
+      <w:start w:val="1"/>
+      <w:numFmt w:val="bullet"/>
+      <w:lvlText w:val="o"/>
+      <w:lvlJc w:val="left"/>
+      <w:pPr>
+        <w:tabs>
+          <w:tab w:val="num" w:pos="1440"/>
+        </w:tabs>
+        <w:ind w:left="1440" w:hanging="360"/>
+      </w:pPr>
+      <w:rPr>
+        <w:rFonts w:ascii="Courier New" w:hAnsi="Courier New" w:hint="default"/>
+        <w:sz w:val="20"/>
+      </w:rPr>
+    </w:lvl>
+    <w:lvl w:ilvl="2" w:tentative="1">
+      <w:start w:val="1"/>
+      <w:numFmt w:val="bullet"/>
+      <w:lvlText w:val=""/>
+      <w:lvlJc w:val="left"/>
+      <w:pPr>
+        <w:tabs>
+          <w:tab w:val="num" w:pos="2160"/>
+        </w:tabs>
+        <w:ind w:left="2160" w:hanging="360"/>
+      </w:pPr>
+      <w:rPr>
+        <w:rFonts w:ascii="Wingdings" w:hAnsi="Wingdings" w:hint="default"/>
+        <w:sz w:val="20"/>
+      </w:rPr>
+    </w:lvl>
+    <w:lvl w:ilvl="3" w:tentative="1">
+      <w:start w:val="1"/>
+      <w:numFmt w:val="bullet"/>
+      <w:lvlText w:val=""/>
+      <w:lvlJc w:val="left"/>
+      <w:pPr>
+        <w:tabs>
+          <w:tab w:val="num" w:pos="2880"/>
+        </w:tabs>
+        <w:ind w:left="2880" w:hanging="360"/>
+      </w:pPr>
+      <w:rPr>
+        <w:rFonts w:ascii="Wingdings" w:hAnsi="Wingdings" w:hint="default"/>
+        <w:sz w:val="20"/>
+      </w:rPr>
+    </w:lvl>
+    <w:lvl w:ilvl="4" w:tentative="1">
+      <w:start w:val="1"/>
+      <w:numFmt w:val="bullet"/>
+      <w:lvlText w:val=""/>
+      <w:lvlJc w:val="left"/>
+      <w:pPr>
+        <w:tabs>
+          <w:tab w:val="num" w:pos="3600"/>
+        </w:tabs>
+        <w:ind w:left="3600" w:hanging="360"/>
+      </w:pPr>
+      <w:rPr>
+        <w:rFonts w:ascii="Wingdings" w:hAnsi="Wingdings" w:hint="default"/>
+        <w:sz w:val="20"/>
+      </w:rPr>
+    </w:lvl>
+    <w:lvl w:ilvl="5" w:tentative="1">
+      <w:start w:val="1"/>
+      <w:numFmt w:val="bullet"/>
+      <w:lvlText w:val=""/>
+      <w:lvlJc w:val="left"/>
+      <w:pPr>
+        <w:tabs>
+          <w:tab w:val="num" w:pos="4320"/>
+        </w:tabs>
+        <w:ind w:left="4320" w:hanging="360"/>
+      </w:pPr>
+      <w:rPr>
+        <w:rFonts w:ascii="Wingdings" w:hAnsi="Wingdings" w:hint="default"/>
+        <w:sz w:val="20"/>
+      </w:rPr>
+    </w:lvl>
+    <w:lvl w:ilvl="6" w:tentative="1">
+      <w:start w:val="1"/>
+      <w:numFmt w:val="bullet"/>
+      <w:lvlText w:val=""/>
+      <w:lvlJc w:val="left"/>
+      <w:pPr>
+        <w:tabs>
+          <w:tab w:val="num" w:pos="5040"/>
+        </w:tabs>
+        <w:ind w:left="5040" w:hanging="360"/>
+      </w:pPr>
+      <w:rPr>
+        <w:rFonts w:ascii="Wingdings" w:hAnsi="Wingdings" w:hint="default"/>
+        <w:sz w:val="20"/>
+      </w:rPr>
+    </w:lvl>
+    <w:lvl w:ilvl="7" w:tentative="1">
+      <w:start w:val="1"/>
+      <w:numFmt w:val="bullet"/>
+      <w:lvlText w:val=""/>
+      <w:lvlJc w:val="left"/>
+      <w:pPr>
+        <w:tabs>
+          <w:tab w:val="num" w:pos="5760"/>
+        </w:tabs>
+        <w:ind w:left="5760" w:hanging="360"/>
+      </w:pPr>
+      <w:rPr>
+        <w:rFonts w:ascii="Wingdings" w:hAnsi="Wingdings" w:hint="default"/>
+        <w:sz w:val="20"/>
+      </w:rPr>
+    </w:lvl>
+    <w:lvl w:ilvl="8" w:tentative="1">
+      <w:start w:val="1"/>
+      <w:numFmt w:val="bullet"/>
+      <w:lvlText w:val=""/>
+      <w:lvlJc w:val="left"/>
+      <w:pPr>
+        <w:tabs>
+          <w:tab w:val="num" w:pos="6480"/>
+        </w:tabs>
+        <w:ind w:left="6480" w:hanging="360"/>
+      </w:pPr>
+      <w:rPr>
+        <w:rFonts w:ascii="Wingdings" w:hAnsi="Wingdings" w:hint="default"/>
+        <w:sz w:val="20"/>
+      </w:rPr>
+    </w:lvl>
+  </w:abstractNum>
+  <w:abstractNum w:abstractNumId="10" w15:restartNumberingAfterBreak="0">
+    <w:nsid w:val="5BB74ED8"/>
+    <w:multiLevelType w:val="multilevel"/>
+    <w:tmpl w:val="F3DA7F18"/>
+    <w:lvl w:ilvl="0">
+      <w:start w:val="1"/>
+      <w:numFmt w:val="bullet"/>
+      <w:lvlText w:val=""/>
+      <w:lvlJc w:val="left"/>
+      <w:pPr>
+        <w:tabs>
+          <w:tab w:val="num" w:pos="720"/>
+        </w:tabs>
+        <w:ind w:left="720" w:hanging="360"/>
+      </w:pPr>
+      <w:rPr>
+        <w:rFonts w:ascii="Symbol" w:hAnsi="Symbol" w:hint="default"/>
+        <w:sz w:val="20"/>
+      </w:rPr>
+    </w:lvl>
+    <w:lvl w:ilvl="1" w:tentative="1">
+      <w:start w:val="1"/>
+      <w:numFmt w:val="bullet"/>
+      <w:lvlText w:val="o"/>
+      <w:lvlJc w:val="left"/>
+      <w:pPr>
+        <w:tabs>
+          <w:tab w:val="num" w:pos="1440"/>
+        </w:tabs>
+        <w:ind w:left="1440" w:hanging="360"/>
+      </w:pPr>
+      <w:rPr>
+        <w:rFonts w:ascii="Courier New" w:hAnsi="Courier New" w:hint="default"/>
+        <w:sz w:val="20"/>
+      </w:rPr>
+    </w:lvl>
+    <w:lvl w:ilvl="2" w:tentative="1">
+      <w:start w:val="1"/>
+      <w:numFmt w:val="bullet"/>
+      <w:lvlText w:val=""/>
+      <w:lvlJc w:val="left"/>
+      <w:pPr>
+        <w:tabs>
+          <w:tab w:val="num" w:pos="2160"/>
+        </w:tabs>
+        <w:ind w:left="2160" w:hanging="360"/>
+      </w:pPr>
+      <w:rPr>
+        <w:rFonts w:ascii="Wingdings" w:hAnsi="Wingdings" w:hint="default"/>
+        <w:sz w:val="20"/>
+      </w:rPr>
+    </w:lvl>
+    <w:lvl w:ilvl="3" w:tentative="1">
+      <w:start w:val="1"/>
+      <w:numFmt w:val="bullet"/>
+      <w:lvlText w:val=""/>
+      <w:lvlJc w:val="left"/>
+      <w:pPr>
+        <w:tabs>
+          <w:tab w:val="num" w:pos="2880"/>
+        </w:tabs>
+        <w:ind w:left="2880" w:hanging="360"/>
+      </w:pPr>
+      <w:rPr>
+        <w:rFonts w:ascii="Wingdings" w:hAnsi="Wingdings" w:hint="default"/>
+        <w:sz w:val="20"/>
+      </w:rPr>
+    </w:lvl>
+    <w:lvl w:ilvl="4" w:tentative="1">
+      <w:start w:val="1"/>
+      <w:numFmt w:val="bullet"/>
+      <w:lvlText w:val=""/>
+      <w:lvlJc w:val="left"/>
+      <w:pPr>
+        <w:tabs>
+          <w:tab w:val="num" w:pos="3600"/>
+        </w:tabs>
+        <w:ind w:left="3600" w:hanging="360"/>
+      </w:pPr>
+      <w:rPr>
+        <w:rFonts w:ascii="Wingdings" w:hAnsi="Wingdings" w:hint="default"/>
+        <w:sz w:val="20"/>
+      </w:rPr>
+    </w:lvl>
+    <w:lvl w:ilvl="5" w:tentative="1">
+      <w:start w:val="1"/>
+      <w:numFmt w:val="bullet"/>
+      <w:lvlText w:val=""/>
+      <w:lvlJc w:val="left"/>
+      <w:pPr>
+        <w:tabs>
+          <w:tab w:val="num" w:pos="4320"/>
+        </w:tabs>
+        <w:ind w:left="4320" w:hanging="360"/>
+      </w:pPr>
+      <w:rPr>
+        <w:rFonts w:ascii="Wingdings" w:hAnsi="Wingdings" w:hint="default"/>
+        <w:sz w:val="20"/>
+      </w:rPr>
+    </w:lvl>
+    <w:lvl w:ilvl="6" w:tentative="1">
+      <w:start w:val="1"/>
+      <w:numFmt w:val="bullet"/>
+      <w:lvlText w:val=""/>
+      <w:lvlJc w:val="left"/>
+      <w:pPr>
+        <w:tabs>
+          <w:tab w:val="num" w:pos="5040"/>
+        </w:tabs>
+        <w:ind w:left="5040" w:hanging="360"/>
+      </w:pPr>
+      <w:rPr>
+        <w:rFonts w:ascii="Wingdings" w:hAnsi="Wingdings" w:hint="default"/>
+        <w:sz w:val="20"/>
+      </w:rPr>
+    </w:lvl>
+    <w:lvl w:ilvl="7" w:tentative="1">
+      <w:start w:val="1"/>
+      <w:numFmt w:val="bullet"/>
+      <w:lvlText w:val=""/>
+      <w:lvlJc w:val="left"/>
+      <w:pPr>
+        <w:tabs>
+          <w:tab w:val="num" w:pos="5760"/>
+        </w:tabs>
+        <w:ind w:left="5760" w:hanging="360"/>
+      </w:pPr>
+      <w:rPr>
+        <w:rFonts w:ascii="Wingdings" w:hAnsi="Wingdings" w:hint="default"/>
+        <w:sz w:val="20"/>
+      </w:rPr>
+    </w:lvl>
+    <w:lvl w:ilvl="8" w:tentative="1">
+      <w:start w:val="1"/>
+      <w:numFmt w:val="bullet"/>
+      <w:lvlText w:val=""/>
+      <w:lvlJc w:val="left"/>
+      <w:pPr>
+        <w:tabs>
+          <w:tab w:val="num" w:pos="6480"/>
+        </w:tabs>
+        <w:ind w:left="6480" w:hanging="360"/>
+      </w:pPr>
+      <w:rPr>
+        <w:rFonts w:ascii="Wingdings" w:hAnsi="Wingdings" w:hint="default"/>
+        <w:sz w:val="20"/>
       </w:rPr>
     </w:lvl>
   </w:abstractNum>
@@ -2561,11 +3556,17 @@
   <w:num w:numId="9" w16cid:durableId="1954556747">
     <w:abstractNumId w:val="0"/>
   </w:num>
+  <w:num w:numId="10" w16cid:durableId="367027580">
+    <w:abstractNumId w:val="10"/>
+  </w:num>
+  <w:num w:numId="11" w16cid:durableId="1037465360">
+    <w:abstractNumId w:val="9"/>
+  </w:num>
 </w:numbering>
 </file>
 
 <file path=word/styles.xml><?xml version="1.0" encoding="utf-8"?>
-<w:styles xmlns:mc="http://schemas.openxmlformats.org/markup-compatibility/2006" xmlns:r="http://schemas.openxmlformats.org/officeDocument/2006/relationships" xmlns:w="http://schemas.openxmlformats.org/wordprocessingml/2006/main" xmlns:w14="http://schemas.microsoft.com/office/word/2010/wordml" xmlns:w15="http://schemas.microsoft.com/office/word/2012/wordml" xmlns:w16cex="http://schemas.microsoft.com/office/word/2018/wordml/cex" xmlns:w16cid="http://schemas.microsoft.com/office/word/2016/wordml/cid" xmlns:w16="http://schemas.microsoft.com/office/word/2018/wordml" xmlns:w16sdtdh="http://schemas.microsoft.com/office/word/2020/wordml/sdtdatahash" xmlns:w16se="http://schemas.microsoft.com/office/word/2015/wordml/symex" mc:Ignorable="w14 w15 w16se w16cid w16 w16cex w16sdtdh">
+<w:styles xmlns:mc="http://schemas.openxmlformats.org/markup-compatibility/2006" xmlns:r="http://schemas.openxmlformats.org/officeDocument/2006/relationships" xmlns:w="http://schemas.openxmlformats.org/wordprocessingml/2006/main" xmlns:w14="http://schemas.microsoft.com/office/word/2010/wordml" xmlns:w15="http://schemas.microsoft.com/office/word/2012/wordml" xmlns:w16cex="http://schemas.microsoft.com/office/word/2018/wordml/cex" xmlns:w16cid="http://schemas.microsoft.com/office/word/2016/wordml/cid" xmlns:w16="http://schemas.microsoft.com/office/word/2018/wordml" xmlns:w16du="http://schemas.microsoft.com/office/word/2023/wordml/word16du" xmlns:w16sdtdh="http://schemas.microsoft.com/office/word/2020/wordml/sdtdatahash" xmlns:w16sdtfl="http://schemas.microsoft.com/office/word/2024/wordml/sdtformatlock" xmlns:w16se="http://schemas.microsoft.com/office/word/2015/wordml/symex" mc:Ignorable="w14 w15 w16se w16cid w16 w16cex w16sdtdh w16sdtfl w16du">
   <w:docDefaults>
     <w:rPrDefault>
       <w:rPr>
@@ -2849,11 +3850,6 @@
     <w:lsdException w:name="Book Title" w:uiPriority="33" w:qFormat="1"/>
     <w:lsdException w:name="Bibliography" w:semiHidden="1" w:uiPriority="37" w:unhideWhenUsed="1"/>
     <w:lsdException w:name="TOC Heading" w:semiHidden="1" w:uiPriority="39" w:unhideWhenUsed="1" w:qFormat="1"/>
-    <w:lsdException w:name="Plain Table 5" w:semiHidden="1" w:unhideWhenUsed="1"/>
-    <w:lsdException w:name="Grid Table Light" w:semiHidden="1" w:unhideWhenUsed="1"/>
-    <w:lsdException w:name="Grid Table 1 Light" w:semiHidden="1" w:unhideWhenUsed="1"/>
-    <w:lsdException w:name="Grid Table 2" w:semiHidden="1" w:unhideWhenUsed="1"/>
-    <w:lsdException w:name="Grid Table 3" w:semiHidden="1" w:unhideWhenUsed="1"/>
     <w:lsdException w:name="Grid Table 4" w:uiPriority="49"/>
     <w:lsdException w:name="Grid Table 5 Dark" w:uiPriority="50"/>
     <w:lsdException w:name="Grid Table 6 Colorful" w:uiPriority="51"/>
@@ -3763,7 +4759,7 @@
       <w:szCs w:val="18"/>
     </w:rPr>
   </w:style>
-  <w:style w:type="character" w:styleId="Textoennegrita">
+  <w:style w:type="character" w:styleId="Fuerte">
     <w:name w:val="Strong"/>
     <w:basedOn w:val="Fuentedeprrafopredeter"/>
     <w:uiPriority w:val="22"/>
@@ -13961,6 +14957,17 @@
     <w:link w:val="Sinespaciado"/>
     <w:uiPriority w:val="1"/>
     <w:rsid w:val="00522206"/>
+  </w:style>
+  <w:style w:type="character" w:styleId="Hipervnculo">
+    <w:name w:val="Hyperlink"/>
+    <w:basedOn w:val="Fuentedeprrafopredeter"/>
+    <w:uiPriority w:val="99"/>
+    <w:unhideWhenUsed/>
+    <w:rsid w:val="007A4827"/>
+    <w:rPr>
+      <w:color w:val="0000FF" w:themeColor="hyperlink"/>
+      <w:u w:val="single"/>
+    </w:rPr>
   </w:style>
 </w:styles>
 </file>

</xml_diff>

<commit_message>
Se agrega la pregunta de negocio y alcance del proyecto
</commit_message>
<xml_diff>
--- a/REPORTE.docx
+++ b/REPORTE.docx
@@ -729,7 +729,32 @@
           <w:rFonts w:ascii="Montserrat Light" w:hAnsi="Montserrat Light"/>
           <w:lang w:val="es-CO"/>
         </w:rPr>
-        <w:t>¿Es posible entrenar un modelo clásico de aprendizaje de máquina que clasifique automáticamente los estadios de sueño a partir de un solo canal de EEG, con un desempeño reportable frente a la literatura (F1-macro, matriz de confusión), y empaquetarlo en una plataforma (API + tablero) que sirva como base reutilizable para una plataforma más completa y flexible?</w:t>
+        <w:t>¿Cómo reducir el tiempo de diagnóstico en el análisis de polisomnografías mediante la clasificación automática de los estadios del sueño con aprendizaje de máquina?</w:t>
+      </w:r>
+    </w:p>
+    <w:p>
+      <w:pPr>
+        <w:spacing w:after="160"/>
+        <w:jc w:val="both"/>
+        <w:rPr>
+          <w:rFonts w:ascii="Montserrat Light" w:hAnsi="Montserrat Light"/>
+          <w:lang w:val="es-CO"/>
+        </w:rPr>
+      </w:pPr>
+      <w:r>
+        <w:rPr>
+          <w:rFonts w:ascii="Montserrat Light" w:hAnsi="Montserrat Light"/>
+          <w:lang w:val="es-CO"/>
+        </w:rPr>
+        <w:t xml:space="preserve">Esta pregunta surge por la necesidad de agilizar el diagnóstico clínico actual. Hoy en día, un especialista debe etiquetar manualmente registros de EEG de 8 horas divididos en miles de épocas de 30 segundos, lo que toma entre 2 y 4 horas por paciente. El uso de aprendizaje de </w:t>
+      </w:r>
+      <w:r>
+        <w:rPr>
+          <w:rFonts w:ascii="Montserrat Light" w:hAnsi="Montserrat Light"/>
+          <w:lang w:val="es-CO"/>
+        </w:rPr>
+        <w:lastRenderedPageBreak/>
+        <w:t>máquina busca eliminar este cuello de botella, automatizando la clasificación para reducir drásticamente el tiempo invertido por examen.</w:t>
       </w:r>
     </w:p>
     <w:p>
@@ -751,14 +776,11 @@
           <w:sz w:val="30"/>
           <w:lang w:val="es-CO"/>
         </w:rPr>
-        <w:lastRenderedPageBreak/>
         <w:t>Alcance del proyecto</w:t>
       </w:r>
     </w:p>
     <w:p>
       <w:pPr>
-        <w:pStyle w:val="Listaconnmeros"/>
-        <w:spacing w:after="40"/>
         <w:rPr>
           <w:rFonts w:ascii="Montserrat Light" w:hAnsi="Montserrat Light"/>
           <w:lang w:val="es-CO"/>
@@ -767,95 +789,170 @@
       <w:r>
         <w:rPr>
           <w:rFonts w:ascii="Montserrat Light" w:hAnsi="Montserrat Light"/>
-          <w:b/>
-          <w:color w:val="444655"/>
-          <w:sz w:val="22"/>
-          <w:lang w:val="es-CO"/>
-        </w:rPr>
-        <w:t>Datos</w:t>
+          <w:lang w:val="es-CO"/>
+        </w:rPr>
+        <w:t>Con fines académicos y de investigación:</w:t>
       </w:r>
     </w:p>
     <w:p>
       <w:pPr>
-        <w:pStyle w:val="Listaconvietas"/>
-        <w:spacing w:after="60"/>
+        <w:pStyle w:val="Prrafodelista"/>
+        <w:numPr>
+          <w:ilvl w:val="0"/>
+          <w:numId w:val="12"/>
+        </w:numPr>
+        <w:spacing w:after="160" w:line="278" w:lineRule="auto"/>
         <w:rPr>
           <w:rFonts w:ascii="Montserrat Light" w:hAnsi="Montserrat Light"/>
           <w:lang w:val="es-CO"/>
         </w:rPr>
       </w:pPr>
+      <w:r>
+        <w:rPr>
+          <w:rFonts w:ascii="Montserrat Light" w:hAnsi="Montserrat Light"/>
+          <w:lang w:val="es-CO"/>
+        </w:rPr>
+        <w:t xml:space="preserve">Datos: se limita al uso de la base de datos pública Sleep-EDF </w:t>
+      </w:r>
+      <w:proofErr w:type="spellStart"/>
+      <w:r>
+        <w:rPr>
+          <w:rFonts w:ascii="Montserrat Light" w:hAnsi="Montserrat Light"/>
+          <w:lang w:val="es-CO"/>
+        </w:rPr>
+        <w:t>Expanded</w:t>
+      </w:r>
+      <w:proofErr w:type="spellEnd"/>
+      <w:r>
+        <w:rPr>
+          <w:rFonts w:ascii="Montserrat Light" w:hAnsi="Montserrat Light"/>
+          <w:lang w:val="es-CO"/>
+        </w:rPr>
+        <w:t>, utilizando aproximadamente 197 registros nocturnos. Se procesarán los canales de EEG (</w:t>
+      </w:r>
+      <w:proofErr w:type="spellStart"/>
+      <w:r>
+        <w:rPr>
+          <w:rFonts w:ascii="Montserrat Light" w:hAnsi="Montserrat Light"/>
+          <w:lang w:val="es-CO"/>
+        </w:rPr>
+        <w:t>Fpz-Cz</w:t>
+      </w:r>
+      <w:proofErr w:type="spellEnd"/>
+      <w:r>
+        <w:rPr>
+          <w:rFonts w:ascii="Montserrat Light" w:hAnsi="Montserrat Light"/>
+          <w:lang w:val="es-CO"/>
+        </w:rPr>
+        <w:t xml:space="preserve"> y </w:t>
+      </w:r>
+      <w:proofErr w:type="spellStart"/>
+      <w:r>
+        <w:rPr>
+          <w:rFonts w:ascii="Montserrat Light" w:hAnsi="Montserrat Light"/>
+          <w:lang w:val="es-CO"/>
+        </w:rPr>
+        <w:t>Pz</w:t>
+      </w:r>
+      <w:proofErr w:type="spellEnd"/>
+      <w:r>
+        <w:rPr>
+          <w:rFonts w:ascii="Montserrat Light" w:hAnsi="Montserrat Light"/>
+          <w:lang w:val="es-CO"/>
+        </w:rPr>
+        <w:t xml:space="preserve">-Oz) y, de estar disponibles, señales complementarias de EOG y EMG, segmentadas en épocas de 30 segundos. Las etiquetas se adaptarán a cinco estadios (W, N1, N2, N3 y REM), descartando o tratando las marcas de movimiento (M) o indefinidas (?). </w:t>
+      </w:r>
     </w:p>
     <w:p>
       <w:pPr>
-        <w:pStyle w:val="Listaconnmeros"/>
-        <w:spacing w:after="40"/>
+        <w:pStyle w:val="Prrafodelista"/>
+        <w:spacing w:after="160" w:line="278" w:lineRule="auto"/>
         <w:rPr>
           <w:rFonts w:ascii="Montserrat Light" w:hAnsi="Montserrat Light"/>
           <w:lang w:val="es-CO"/>
         </w:rPr>
       </w:pPr>
-      <w:r>
-        <w:rPr>
-          <w:rFonts w:ascii="Montserrat Light" w:hAnsi="Montserrat Light"/>
-          <w:b/>
-          <w:color w:val="444655"/>
-          <w:sz w:val="22"/>
-          <w:lang w:val="es-CO"/>
-        </w:rPr>
-        <w:t>Modelo</w:t>
-      </w:r>
     </w:p>
     <w:p>
       <w:pPr>
-        <w:pStyle w:val="Listaconvietas"/>
-        <w:spacing w:after="60"/>
+        <w:pStyle w:val="Prrafodelista"/>
+        <w:numPr>
+          <w:ilvl w:val="0"/>
+          <w:numId w:val="12"/>
+        </w:numPr>
+        <w:spacing w:after="160" w:line="278" w:lineRule="auto"/>
         <w:rPr>
           <w:rFonts w:ascii="Montserrat Light" w:hAnsi="Montserrat Light"/>
           <w:lang w:val="es-CO"/>
         </w:rPr>
       </w:pPr>
+      <w:r>
+        <w:rPr>
+          <w:rFonts w:ascii="Montserrat Light" w:hAnsi="Montserrat Light"/>
+          <w:lang w:val="es-CO"/>
+        </w:rPr>
+        <w:t xml:space="preserve">Modelo: se limita al desarrollo y comparación de algoritmos para clasificar las cinco fases del sueño. Se evaluarán enfoques tradicionales basados en características estadísticas (como Random Forest o </w:t>
+      </w:r>
+      <w:proofErr w:type="spellStart"/>
+      <w:r>
+        <w:rPr>
+          <w:rFonts w:ascii="Montserrat Light" w:hAnsi="Montserrat Light"/>
+          <w:lang w:val="es-CO"/>
+        </w:rPr>
+        <w:t>LightGBM</w:t>
+      </w:r>
+      <w:proofErr w:type="spellEnd"/>
+      <w:r>
+        <w:rPr>
+          <w:rFonts w:ascii="Montserrat Light" w:hAnsi="Montserrat Light"/>
+          <w:lang w:val="es-CO"/>
+        </w:rPr>
+        <w:t xml:space="preserve">) frente a redes de aprendizaje profundo (como CNN 1D o </w:t>
+      </w:r>
+      <w:proofErr w:type="spellStart"/>
+      <w:r>
+        <w:rPr>
+          <w:rFonts w:ascii="Montserrat Light" w:hAnsi="Montserrat Light"/>
+          <w:lang w:val="es-CO"/>
+        </w:rPr>
+        <w:t>TinySleepNet</w:t>
+      </w:r>
+      <w:proofErr w:type="spellEnd"/>
+      <w:r>
+        <w:rPr>
+          <w:rFonts w:ascii="Montserrat Light" w:hAnsi="Montserrat Light"/>
+          <w:lang w:val="es-CO"/>
+        </w:rPr>
+        <w:t>). El desempeño se medirá mediante exactitud global, F1-score macro y matrices de confusión, con énfasis en la clase minoritaria N1, contrastando los resultados únicamente con la literatura que use la misma base de datos.</w:t>
+      </w:r>
     </w:p>
     <w:p>
       <w:pPr>
-        <w:pStyle w:val="Listaconnmeros"/>
-        <w:spacing w:after="40"/>
+        <w:pStyle w:val="Prrafodelista"/>
         <w:rPr>
           <w:rFonts w:ascii="Montserrat Light" w:hAnsi="Montserrat Light"/>
           <w:lang w:val="es-CO"/>
         </w:rPr>
       </w:pPr>
-      <w:r>
-        <w:rPr>
-          <w:rFonts w:ascii="Montserrat Light" w:hAnsi="Montserrat Light"/>
-          <w:b/>
-          <w:color w:val="444655"/>
-          <w:sz w:val="22"/>
-          <w:lang w:val="es-CO"/>
-        </w:rPr>
-        <w:t>Prototipo tecnológico</w:t>
-      </w:r>
     </w:p>
     <w:p>
       <w:pPr>
-        <w:pStyle w:val="Listaconvietas"/>
-        <w:spacing w:after="60"/>
+        <w:pStyle w:val="Prrafodelista"/>
+        <w:spacing w:after="160" w:line="278" w:lineRule="auto"/>
         <w:rPr>
           <w:rFonts w:ascii="Montserrat Light" w:hAnsi="Montserrat Light"/>
           <w:lang w:val="es-CO"/>
         </w:rPr>
       </w:pPr>
-      <w:r>
-        <w:rPr>
-          <w:rFonts w:ascii="Montserrat Light" w:hAnsi="Montserrat Light"/>
-          <w:lang w:val="es-CO"/>
-        </w:rPr>
-        <w:t>API que sirve el modelo Random Forest entrenado (recibe una época o un registro EDF completo, devuelve el estadio predicho).</w:t>
-      </w:r>
     </w:p>
     <w:p>
       <w:pPr>
-        <w:pStyle w:val="Listaconvietas"/>
-        <w:spacing w:after="60"/>
+        <w:pStyle w:val="Prrafodelista"/>
+        <w:numPr>
+          <w:ilvl w:val="0"/>
+          <w:numId w:val="12"/>
+        </w:numPr>
+        <w:spacing w:after="160" w:line="278" w:lineRule="auto"/>
         <w:rPr>
           <w:rFonts w:ascii="Montserrat Light" w:hAnsi="Montserrat Light"/>
           <w:lang w:val="es-CO"/>
@@ -866,7 +963,7 @@
           <w:rFonts w:ascii="Montserrat Light" w:hAnsi="Montserrat Light"/>
           <w:lang w:val="es-CO"/>
         </w:rPr>
-        <w:t xml:space="preserve">Tablero que consume la API y visualiza el </w:t>
+        <w:t>Prototipo: se limita al desarrollo de una plataforma funcional que permita cargar registros de señales fisiológicas y visualizar la clasificación automática del sueño. El sistema exigirá como requisito mínimo al menos un canal de EEG (</w:t>
       </w:r>
       <w:proofErr w:type="spellStart"/>
       <w:r>
@@ -874,7 +971,7 @@
           <w:rFonts w:ascii="Montserrat Light" w:hAnsi="Montserrat Light"/>
           <w:lang w:val="es-CO"/>
         </w:rPr>
-        <w:t>hipnograma</w:t>
+        <w:t>Fpz-Cz</w:t>
       </w:r>
       <w:proofErr w:type="spellEnd"/>
       <w:r>
@@ -882,30 +979,43 @@
           <w:rFonts w:ascii="Montserrat Light" w:hAnsi="Montserrat Light"/>
           <w:lang w:val="es-CO"/>
         </w:rPr>
-        <w:t xml:space="preserve"> predicho vs. real, matriz de confusión y F1 por clase (ver maqueta más abajo).</w:t>
+        <w:t xml:space="preserve"> o </w:t>
+      </w:r>
+      <w:proofErr w:type="spellStart"/>
+      <w:r>
+        <w:rPr>
+          <w:rFonts w:ascii="Montserrat Light" w:hAnsi="Montserrat Light"/>
+          <w:lang w:val="es-CO"/>
+        </w:rPr>
+        <w:t>Pz</w:t>
+      </w:r>
+      <w:proofErr w:type="spellEnd"/>
+      <w:r>
+        <w:rPr>
+          <w:rFonts w:ascii="Montserrat Light" w:hAnsi="Montserrat Light"/>
+          <w:lang w:val="es-CO"/>
+        </w:rPr>
+        <w:t>-Oz), permitiendo opcionalmente incorporar señales de EOG y EMG para evaluar la robustez del modelo ante diferentes combinaciones de entrada. Finalmente, se medirá la utilidad del software analizando su capacidad para reducir el tiempo de revisión manual y mitigar la variabilidad entre evaluadores, operando estrictamente como una herramienta de apoyo y no como un sistema de diagnóstico médico certificado.</w:t>
       </w:r>
     </w:p>
     <w:p>
       <w:pPr>
-        <w:pStyle w:val="Listaconvietas"/>
-        <w:spacing w:after="60"/>
+        <w:pStyle w:val="Prrafodelista"/>
+        <w:spacing w:after="160" w:line="278" w:lineRule="auto"/>
         <w:rPr>
           <w:rFonts w:ascii="Montserrat Light" w:hAnsi="Montserrat Light"/>
           <w:lang w:val="es-CO"/>
         </w:rPr>
       </w:pPr>
-      <w:r>
-        <w:rPr>
-          <w:rFonts w:ascii="Montserrat Light" w:hAnsi="Montserrat Light"/>
-          <w:lang w:val="es-CO"/>
-        </w:rPr>
-        <w:t>Despliegue de API y tablero en contenedores Docker.</w:t>
-      </w:r>
     </w:p>
     <w:p>
       <w:pPr>
-        <w:pStyle w:val="Listaconnmeros"/>
-        <w:spacing w:after="40"/>
+        <w:pStyle w:val="Prrafodelista"/>
+        <w:numPr>
+          <w:ilvl w:val="0"/>
+          <w:numId w:val="12"/>
+        </w:numPr>
+        <w:spacing w:after="160" w:line="278" w:lineRule="auto"/>
         <w:rPr>
           <w:rFonts w:ascii="Montserrat Light" w:hAnsi="Montserrat Light"/>
           <w:lang w:val="es-CO"/>
@@ -914,18 +1024,14 @@
       <w:r>
         <w:rPr>
           <w:rFonts w:ascii="Montserrat Light" w:hAnsi="Montserrat Light"/>
-          <w:b/>
-          <w:color w:val="444655"/>
-          <w:sz w:val="22"/>
-          <w:lang w:val="es-CO"/>
-        </w:rPr>
-        <w:t>Limitaciones</w:t>
+          <w:lang w:val="es-CO"/>
+        </w:rPr>
+        <w:t>Limitaciones: el software se desarrollará a nivel de prototipo experimental y funcionará estrictamente como una herramienta de apoyo al análisis; por lo tanto, queda fuera del alcance emitir diagnósticos médicos automáticos, detectar trastornos específicos del sueño o cumplir con las certificaciones regulatorias exigidas para sistemas de uso clínico institucional.</w:t>
       </w:r>
     </w:p>
     <w:p>
       <w:pPr>
-        <w:pStyle w:val="Listaconvietas"/>
-        <w:spacing w:after="60"/>
+        <w:pStyle w:val="Prrafodelista"/>
         <w:rPr>
           <w:rFonts w:ascii="Montserrat Light" w:hAnsi="Montserrat Light"/>
           <w:lang w:val="es-CO"/>
@@ -934,28 +1040,52 @@
     </w:p>
     <w:p>
       <w:pPr>
-        <w:pStyle w:val="Listaconnmeros"/>
-        <w:spacing w:after="40"/>
+        <w:pStyle w:val="Prrafodelista"/>
+        <w:spacing w:after="160" w:line="278" w:lineRule="auto"/>
         <w:rPr>
           <w:rFonts w:ascii="Montserrat Light" w:hAnsi="Montserrat Light"/>
           <w:lang w:val="es-CO"/>
         </w:rPr>
       </w:pPr>
-      <w:r>
-        <w:rPr>
-          <w:rFonts w:ascii="Montserrat Light" w:hAnsi="Montserrat Light"/>
-          <w:b/>
-          <w:color w:val="444655"/>
-          <w:sz w:val="22"/>
-          <w:lang w:val="es-CO"/>
-        </w:rPr>
-        <w:t>Resultados esperados</w:t>
-      </w:r>
     </w:p>
     <w:p>
       <w:pPr>
-        <w:pStyle w:val="Listaconvietas"/>
-        <w:spacing w:after="60"/>
+        <w:pStyle w:val="Prrafodelista"/>
+        <w:numPr>
+          <w:ilvl w:val="0"/>
+          <w:numId w:val="12"/>
+        </w:numPr>
+        <w:spacing w:after="160" w:line="278" w:lineRule="auto"/>
+        <w:rPr>
+          <w:rFonts w:ascii="Montserrat Light" w:hAnsi="Montserrat Light"/>
+          <w:lang w:val="es-CO"/>
+        </w:rPr>
+      </w:pPr>
+      <w:r>
+        <w:rPr>
+          <w:rFonts w:ascii="Montserrat Light" w:hAnsi="Montserrat Light"/>
+          <w:lang w:val="es-CO"/>
+        </w:rPr>
+        <w:t xml:space="preserve">Resultados esperados: la entrega de un modelo optimizado de aprendizaje de máquina con métricas competitivas de exactitud y F1-score (especialmente en la fase N1), un estudio comparativo documentado entre enfoques tradicionales y de aprendizaje profundo, y un prototipo funcional de plataforma que procese de forma multicanal las señales. Finalmente, se espera demostrar conceptualmente una reducción significativa en el tiempo de revisión y una menor variabilidad en el </w:t>
+      </w:r>
+      <w:r>
+        <w:rPr>
+          <w:rFonts w:ascii="Montserrat Light" w:hAnsi="Montserrat Light"/>
+          <w:lang w:val="es-CO"/>
+        </w:rPr>
+        <w:lastRenderedPageBreak/>
+        <w:t>etiquetado de los estadios del sueño en comparación con el método manual tradicional.</w:t>
+      </w:r>
+    </w:p>
+    <w:p>
+      <w:pPr>
+        <w:pStyle w:val="Listaconnmeros"/>
+        <w:numPr>
+          <w:ilvl w:val="0"/>
+          <w:numId w:val="0"/>
+        </w:numPr>
+        <w:spacing w:after="40"/>
+        <w:ind w:left="360" w:hanging="360"/>
         <w:rPr>
           <w:rFonts w:ascii="Montserrat Light" w:hAnsi="Montserrat Light"/>
           <w:lang w:val="es-CO"/>
@@ -1684,7 +1814,6 @@
           <w:szCs w:val="21"/>
           <w:lang w:val="es-CO"/>
         </w:rPr>
-        <w:lastRenderedPageBreak/>
         <w:t xml:space="preserve">Un </w:t>
       </w:r>
       <w:proofErr w:type="spellStart"/>
@@ -1905,6 +2034,7 @@
           <w:sz w:val="30"/>
           <w:lang w:val="es-CO"/>
         </w:rPr>
+        <w:lastRenderedPageBreak/>
         <w:t>Exploración inicial de los datos (EDA)</w:t>
       </w:r>
     </w:p>
@@ -2395,7 +2525,6 @@
           <w:noProof/>
           <w:lang w:val="es-CO"/>
         </w:rPr>
-        <w:lastRenderedPageBreak/>
         <w:drawing>
           <wp:inline distT="0" distB="0" distL="0" distR="0" wp14:anchorId="1E907EF7" wp14:editId="28639539">
             <wp:extent cx="5580000" cy="3313125"/>
@@ -2570,6 +2699,7 @@
           <w:rFonts w:ascii="Montserrat Light" w:hAnsi="Montserrat Light"/>
           <w:lang w:val="es-CO"/>
         </w:rPr>
+        <w:lastRenderedPageBreak/>
         <w:t xml:space="preserve">Panel de contexto: duración del registro, número de épocas, canal de entrada verificado (EEG </w:t>
       </w:r>
       <w:proofErr w:type="spellStart"/>
@@ -2586,7 +2716,23 @@
           <w:rFonts w:ascii="Montserrat Light" w:hAnsi="Montserrat Light"/>
           <w:lang w:val="es-CO"/>
         </w:rPr>
-        <w:t>) y chips de calidad de datos (épocas “M”/“?” excluidas), para no ocultar problemas de calidad de los datos frente al usuario.</w:t>
+        <w:t>) y chips de calidad de datos (épocas “</w:t>
+      </w:r>
+      <w:proofErr w:type="gramStart"/>
+      <w:r>
+        <w:rPr>
+          <w:rFonts w:ascii="Montserrat Light" w:hAnsi="Montserrat Light"/>
+          <w:lang w:val="es-CO"/>
+        </w:rPr>
+        <w:t>M”/</w:t>
+      </w:r>
+      <w:proofErr w:type="gramEnd"/>
+      <w:r>
+        <w:rPr>
+          <w:rFonts w:ascii="Montserrat Light" w:hAnsi="Montserrat Light"/>
+          <w:lang w:val="es-CO"/>
+        </w:rPr>
+        <w:t>“?” excluidas), para no ocultar problemas de calidad de los datos frente al usuario.</w:t>
       </w:r>
     </w:p>
     <w:p>
@@ -2785,7 +2931,6 @@
           <w:color w:val="444655"/>
           <w:lang w:val="es-CO"/>
         </w:rPr>
-        <w:lastRenderedPageBreak/>
         <w:t xml:space="preserve">Infraestructura utilizada: </w:t>
       </w:r>
     </w:p>
@@ -3381,6 +3526,95 @@
     </w:lvl>
   </w:abstractNum>
   <w:abstractNum w:abstractNumId="10" w15:restartNumberingAfterBreak="0">
+    <w:nsid w:val="33660434"/>
+    <w:multiLevelType w:val="hybridMultilevel"/>
+    <w:tmpl w:val="5EF44CF6"/>
+    <w:lvl w:ilvl="0" w:tplc="240A000F">
+      <w:start w:val="1"/>
+      <w:numFmt w:val="decimal"/>
+      <w:lvlText w:val="%1."/>
+      <w:lvlJc w:val="left"/>
+      <w:pPr>
+        <w:ind w:left="720" w:hanging="360"/>
+      </w:pPr>
+      <w:rPr>
+        <w:rFonts w:hint="default"/>
+      </w:rPr>
+    </w:lvl>
+    <w:lvl w:ilvl="1" w:tplc="240A0019" w:tentative="1">
+      <w:start w:val="1"/>
+      <w:numFmt w:val="lowerLetter"/>
+      <w:lvlText w:val="%2."/>
+      <w:lvlJc w:val="left"/>
+      <w:pPr>
+        <w:ind w:left="1440" w:hanging="360"/>
+      </w:pPr>
+    </w:lvl>
+    <w:lvl w:ilvl="2" w:tplc="240A001B" w:tentative="1">
+      <w:start w:val="1"/>
+      <w:numFmt w:val="lowerRoman"/>
+      <w:lvlText w:val="%3."/>
+      <w:lvlJc w:val="right"/>
+      <w:pPr>
+        <w:ind w:left="2160" w:hanging="180"/>
+      </w:pPr>
+    </w:lvl>
+    <w:lvl w:ilvl="3" w:tplc="240A000F" w:tentative="1">
+      <w:start w:val="1"/>
+      <w:numFmt w:val="decimal"/>
+      <w:lvlText w:val="%4."/>
+      <w:lvlJc w:val="left"/>
+      <w:pPr>
+        <w:ind w:left="2880" w:hanging="360"/>
+      </w:pPr>
+    </w:lvl>
+    <w:lvl w:ilvl="4" w:tplc="240A0019" w:tentative="1">
+      <w:start w:val="1"/>
+      <w:numFmt w:val="lowerLetter"/>
+      <w:lvlText w:val="%5."/>
+      <w:lvlJc w:val="left"/>
+      <w:pPr>
+        <w:ind w:left="3600" w:hanging="360"/>
+      </w:pPr>
+    </w:lvl>
+    <w:lvl w:ilvl="5" w:tplc="240A001B" w:tentative="1">
+      <w:start w:val="1"/>
+      <w:numFmt w:val="lowerRoman"/>
+      <w:lvlText w:val="%6."/>
+      <w:lvlJc w:val="right"/>
+      <w:pPr>
+        <w:ind w:left="4320" w:hanging="180"/>
+      </w:pPr>
+    </w:lvl>
+    <w:lvl w:ilvl="6" w:tplc="240A000F" w:tentative="1">
+      <w:start w:val="1"/>
+      <w:numFmt w:val="decimal"/>
+      <w:lvlText w:val="%7."/>
+      <w:lvlJc w:val="left"/>
+      <w:pPr>
+        <w:ind w:left="5040" w:hanging="360"/>
+      </w:pPr>
+    </w:lvl>
+    <w:lvl w:ilvl="7" w:tplc="240A0019" w:tentative="1">
+      <w:start w:val="1"/>
+      <w:numFmt w:val="lowerLetter"/>
+      <w:lvlText w:val="%8."/>
+      <w:lvlJc w:val="left"/>
+      <w:pPr>
+        <w:ind w:left="5760" w:hanging="360"/>
+      </w:pPr>
+    </w:lvl>
+    <w:lvl w:ilvl="8" w:tplc="240A001B" w:tentative="1">
+      <w:start w:val="1"/>
+      <w:numFmt w:val="lowerRoman"/>
+      <w:lvlText w:val="%9."/>
+      <w:lvlJc w:val="right"/>
+      <w:pPr>
+        <w:ind w:left="6480" w:hanging="180"/>
+      </w:pPr>
+    </w:lvl>
+  </w:abstractNum>
+  <w:abstractNum w:abstractNumId="11" w15:restartNumberingAfterBreak="0">
     <w:nsid w:val="5BB74ED8"/>
     <w:multiLevelType w:val="multilevel"/>
     <w:tmpl w:val="F3DA7F18"/>
@@ -3557,10 +3791,13 @@
     <w:abstractNumId w:val="0"/>
   </w:num>
   <w:num w:numId="10" w16cid:durableId="367027580">
-    <w:abstractNumId w:val="10"/>
+    <w:abstractNumId w:val="11"/>
   </w:num>
   <w:num w:numId="11" w16cid:durableId="1037465360">
     <w:abstractNumId w:val="9"/>
+  </w:num>
+  <w:num w:numId="12" w16cid:durableId="1678846118">
+    <w:abstractNumId w:val="10"/>
   </w:num>
 </w:numbering>
 </file>

</xml_diff>